<commit_message>
feat: add API_LuuHopDong stored procedure and document export utility for contract management
</commit_message>
<xml_diff>
--- a/backend-app/samples/FILE MAU HOP DONG CÒN LẠI/3.2 MAU HDONG - 0406 (HỘI NGHỊ ).docx
+++ b/backend-app/samples/FILE MAU HOP DONG CÒN LẠI/3.2 MAU HDONG - 0406 (HỘI NGHỊ ).docx
@@ -1,63 +1,5 @@
 
-<file path=customXml\item1.xml><?xml version="1.0" encoding="utf-8"?>
-<s:customData xmlns="http://www.wps.cn/officeDocument/2013/wpsCustomData" xmlns:s="http://www.wps.cn/officeDocument/2013/wpsCustomData">
-  <customSectProps/>
-  <customShpExts>
-    <customShpInfo spid="_x0000_s1026" textRotate="1"/>
-  </customShpExts>
-</s:customData>
-</file>
-
-<file path=customXml\itemProps1.xml><?xml version="1.0" encoding="utf-8"?>
-<ds:datastoreItem xmlns:ds="http://schemas.openxmlformats.org/officeDocument/2006/customXml" ds:itemID="{B1977F7D-205B-4081-913C-38D41E755F92}">
-  <ds:schemaRefs>
-    <ds:schemaRef ds:uri="http://www.wps.cn/officeDocument/2013/wpsCustomData"/>
-  </ds:schemaRefs>
-</ds:datastoreItem>
-</file>
-
-<file path=docProps\app.xml><?xml version="1.0" encoding="utf-8"?>
-<Properties xmlns="http://schemas.openxmlformats.org/officeDocument/2006/extended-properties" xmlns:vt="http://schemas.openxmlformats.org/officeDocument/2006/docPropsVTypes">
-  <Template>Normal</Template>
-  <Pages>18</Pages>
-  <Words>577</Words>
-  <Characters>2380</Characters>
-  <Lines>1</Lines>
-  <Paragraphs>1</Paragraphs>
-  <TotalTime>0</TotalTime>
-  <ScaleCrop>false</ScaleCrop>
-  <LinksUpToDate>false</LinksUpToDate>
-  <CharactersWithSpaces>2943</CharactersWithSpaces>
-  <Application>WPS Office_12.1.0.26880_F1E327BC-269C-435d-A152-05C5408002CA</Application>
-  <DocSecurity>0</DocSecurity>
-</Properties>
-</file>
-
-<file path=docProps\core.xml><?xml version="1.0" encoding="utf-8"?>
-<cp:coreProperties xmlns:cp="http://schemas.openxmlformats.org/package/2006/metadata/core-properties" xmlns:dc="http://purl.org/dc/elements/1.1/" xmlns:dcterms="http://purl.org/dc/terms/" xmlns:dcmitype="http://purl.org/dc/dcmitype/" xmlns:xsi="http://www.w3.org/2001/XMLSchema-instance">
-  <dcterms:created xsi:type="dcterms:W3CDTF">2025-12-02T06:24:00Z</dcterms:created>
-  <dc:creator>Truong Nhut Thuy</dc:creator>
-  <cp:lastModifiedBy>Dell3070</cp:lastModifiedBy>
-  <dcterms:modified xsi:type="dcterms:W3CDTF">2026-06-10T06:33:35Z</dcterms:modified>
-  <cp:revision>1</cp:revision>
-</cp:coreProperties>
-</file>
-
-<file path=docProps\custom.xml><?xml version="1.0" encoding="utf-8"?>
-<Properties xmlns="http://schemas.openxmlformats.org/officeDocument/2006/custom-properties" xmlns:vt="http://schemas.openxmlformats.org/officeDocument/2006/docPropsVTypes">
-  <property fmtid="{D5CDD505-2E9C-101B-9397-08002B2CF9AE}" pid="2" name="KSOProductBuildVer">
-    <vt:lpwstr>1033-12.1.0.26880</vt:lpwstr>
-  </property>
-  <property fmtid="{D5CDD505-2E9C-101B-9397-08002B2CF9AE}" pid="3" name="ICV">
-    <vt:lpwstr>CE6651FBF2684676B34A8907B1A90C69_11</vt:lpwstr>
-  </property>
-  <property fmtid="{D5CDD505-2E9C-101B-9397-08002B2CF9AE}" pid="4" name="KSOTemplateDocerSaveRecord">
-    <vt:lpwstr>eyJoZGlkIjoiYTJmYzZiNzA0MjJkZjA3YmRmYTQ1N2VlZWVlZDk3MzgifQ==</vt:lpwstr>
-  </property>
-</Properties>
-</file>
-
-<file path=word\document.xml><?xml version="1.0" encoding="utf-8"?>
+<file path=word/document.xml><?xml version="1.0" encoding="utf-8"?>
 <w:document xmlns:wpc="http://schemas.microsoft.com/office/word/2010/wordprocessingCanvas" xmlns:mc="http://schemas.openxmlformats.org/markup-compatibility/2006" xmlns:o="urn:schemas-microsoft-com:office:office" xmlns:r="http://schemas.openxmlformats.org/officeDocument/2006/relationships" xmlns:m="http://schemas.openxmlformats.org/officeDocument/2006/math" xmlns:v="urn:schemas-microsoft-com:vml" xmlns:wp14="http://schemas.microsoft.com/office/word/2010/wordprocessingDrawing" xmlns:wp="http://schemas.openxmlformats.org/drawingml/2006/wordprocessingDrawing" xmlns:w="http://schemas.openxmlformats.org/wordprocessingml/2006/main" xmlns:w14="http://schemas.microsoft.com/office/word/2010/wordml" xmlns:w10="urn:schemas-microsoft-com:office:word" xmlns:w15="http://schemas.microsoft.com/office/word/2012/wordml" xmlns:wpg="http://schemas.microsoft.com/office/word/2010/wordprocessingGroup" xmlns:wpi="http://schemas.microsoft.com/office/word/2010/wordprocessingInk" xmlns:wne="http://schemas.microsoft.com/office/word/2006/wordml" xmlns:wps="http://schemas.microsoft.com/office/word/2010/wordprocessingShape" xmlns:wpsCustomData="http://www.wps.cn/officeDocument/2013/wpsCustomData" mc:Ignorable="w14 w15 wp14">
   <w:body>
     <w:p>
@@ -248,27 +190,31 @@
         <w:ind w:left="320" w:leftChars="100"/>
         <w:rPr>
           <w:rFonts w:ascii="Times New Roman" w:hAnsi="Times New Roman"/>
-          <w:sz w:val="24"/>
-          <w:szCs w:val="24"/>
-        </w:rPr>
-      </w:pPr>
-      <w:r>
-        <w:rPr>
-          <w:rFonts w:ascii="Times New Roman" w:hAnsi="Times New Roman"/>
           <w:i/>
           <w:iCs/>
           <w:sz w:val="24"/>
           <w:szCs w:val="24"/>
         </w:rPr>
-        <w:t>Số: …</w:t>
-      </w:r>
-      <w:r>
-        <w:rPr>
-          <w:rFonts w:ascii="Times New Roman" w:hAnsi="Times New Roman"/>
+      </w:pPr>
+      <w:r>
+        <w:rPr>
+          <w:rFonts w:ascii="Times New Roman" w:hAnsi="Times New Roman"/>
+          <w:i/>
+          <w:iCs/>
           <w:sz w:val="24"/>
           <w:szCs w:val="24"/>
         </w:rPr>
-        <w:t xml:space="preserve"> /CTY-HHKH/2025</w:t>
+        <w:t xml:space="preserve">Số: </w:t>
+      </w:r>
+      <w:r>
+        <w:rPr>
+          <w:rFonts w:hint="default" w:ascii="Times New Roman" w:hAnsi="Times New Roman"/>
+          <w:i/>
+          <w:iCs/>
+          <w:sz w:val="24"/>
+          <w:szCs w:val="24"/>
+        </w:rPr>
+        <w:t>{Sohopdong}</w:t>
       </w:r>
     </w:p>
     <w:p>
@@ -464,12 +410,21 @@
       </w:pPr>
       <w:r>
         <w:rPr>
-          <w:rFonts w:ascii="Times New Roman" w:hAnsi="Times New Roman"/>
+          <w:rFonts w:hint="default" w:ascii="Times New Roman" w:hAnsi="Times New Roman"/>
           <w:iCs/>
           <w:sz w:val="26"/>
           <w:szCs w:val="26"/>
         </w:rPr>
-        <w:t xml:space="preserve">Hôm nay, ngày …. tháng… năm 2025, tại Công ty </w:t>
+        <w:t>Hôm nay, ngày {NgayLapHD} tháng {ThangLapHD} năm {NamLapHD}, tại</w:t>
+      </w:r>
+      <w:r>
+        <w:rPr>
+          <w:rFonts w:ascii="Times New Roman" w:hAnsi="Times New Roman"/>
+          <w:iCs/>
+          <w:sz w:val="26"/>
+          <w:szCs w:val="26"/>
+        </w:rPr>
+        <w:t xml:space="preserve"> Công ty </w:t>
       </w:r>
       <w:r>
         <w:rPr>
@@ -1340,8 +1295,6 @@
         </w:rPr>
         <w:t>Ten</w:t>
       </w:r>
-      <w:bookmarkStart w:id="3" w:name="_GoBack"/>
-      <w:bookmarkEnd w:id="3"/>
       <w:r>
         <w:rPr>
           <w:rFonts w:hint="default" w:ascii="Times New Roman" w:hAnsi="Times New Roman" w:eastAsia="SimSun"/>
@@ -2088,12 +2041,6 @@
             <w:insideH w:val="none" w:color="auto" w:sz="0" w:space="0"/>
             <w:insideV w:val="none" w:color="auto" w:sz="0" w:space="0"/>
           </w:tblBorders>
-          <w:tblCellMar>
-            <w:top w:w="0" w:type="dxa"/>
-            <w:left w:w="108" w:type="dxa"/>
-            <w:bottom w:w="0" w:type="dxa"/>
-            <w:right w:w="108" w:type="dxa"/>
-          </w:tblCellMar>
         </w:tblPrEx>
         <w:tc>
           <w:tcPr>
@@ -5519,8 +5466,28 @@
           <w:szCs w:val="26"/>
           <w:lang w:eastAsia="zh-CN" w:bidi="ar"/>
         </w:rPr>
-        <w:t>Dịch vụ cho thuê địa điểm tổ chức sự kiện và các dịch vụ đi kèm theo HĐ số …</w:t>
-      </w:r>
+        <w:t xml:space="preserve">Dịch vụ cho thuê địa điểm tổ chức sự kiện và các dịch vụ đi kèm theo </w:t>
+      </w:r>
+      <w:r>
+        <w:rPr>
+          <w:rFonts w:hint="default" w:ascii="Times New Roman" w:hAnsi="Times New Roman" w:eastAsia="SimSun"/>
+          <w:sz w:val="26"/>
+          <w:szCs w:val="26"/>
+          <w:lang w:eastAsia="zh-CN" w:bidi="ar"/>
+        </w:rPr>
+        <w:t>HĐ số {Sohopdong} ký ngày {NgayLapHD}/{ThangLapHD}/{NamLapHD}</w:t>
+      </w:r>
+      <w:r>
+        <w:rPr>
+          <w:rFonts w:hint="default" w:ascii="Times New Roman" w:hAnsi="Times New Roman" w:eastAsia="SimSun"/>
+          <w:sz w:val="26"/>
+          <w:szCs w:val="26"/>
+          <w:lang w:val="en-US" w:eastAsia="zh-CN" w:bidi="ar"/>
+        </w:rPr>
+        <w:t xml:space="preserve"> </w:t>
+      </w:r>
+      <w:bookmarkStart w:id="3" w:name="_GoBack"/>
+      <w:bookmarkEnd w:id="3"/>
       <w:r>
         <w:rPr>
           <w:rFonts w:ascii="Times New Roman" w:hAnsi="Times New Roman" w:eastAsia="TimesNewRomanPS-BoldMT"/>
@@ -5530,7 +5497,7 @@
           <w:szCs w:val="26"/>
           <w:lang w:eastAsia="zh-CN" w:bidi="ar"/>
         </w:rPr>
-        <w:t>/CTY-HHKH/2025 ký ngày…và Biên bản nghiệm thu và Quyết toán dịch vụ số … ……………ký ngày………</w:t>
+        <w:t>và Biên bản nghiệm thu và Quyết toán dịch vụ số … ……………ký ngày………</w:t>
       </w:r>
       <w:bookmarkEnd w:id="2"/>
     </w:p>
@@ -33618,175 +33585,7 @@
 </w:document>
 </file>
 
-<file path=word\fontTable.xml><?xml version="1.0" encoding="utf-8"?>
-<w:fonts xmlns:mc="http://schemas.openxmlformats.org/markup-compatibility/2006" xmlns:r="http://schemas.openxmlformats.org/officeDocument/2006/relationships" xmlns:w="http://schemas.openxmlformats.org/wordprocessingml/2006/main" xmlns:w14="http://schemas.microsoft.com/office/word/2010/wordml" mc:Ignorable="w14">
-  <w:font w:name="Times New Roman">
-    <w:panose1 w:val="02020603050405020304"/>
-    <w:charset w:val="00"/>
-    <w:family w:val="roman"/>
-    <w:pitch w:val="variable"/>
-    <w:sig w:usb0="20007A87" w:usb1="80000000" w:usb2="00000008" w:usb3="00000000" w:csb0="000001FF" w:csb1="00000000"/>
-  </w:font>
-  <w:font w:name="宋体">
-    <w:altName w:val="SimSun"/>
-    <w:panose1 w:val="02010600030101010101"/>
-    <w:charset w:val="86"/>
-    <w:family w:val="auto"/>
-    <w:pitch w:val="variable"/>
-    <w:sig w:usb0="00000003" w:usb1="080E0000" w:usb2="00000010" w:usb3="00000000" w:csb0="00040001" w:csb1="00000000"/>
-  </w:font>
-  <w:font w:name="SimSun">
-    <w:panose1 w:val="02010600030101010101"/>
-    <w:charset w:val="86"/>
-    <w:family w:val="auto"/>
-    <w:pitch w:val="default"/>
-    <w:sig w:usb0="00000203" w:usb1="288F0000" w:usb2="00000006" w:usb3="00000000" w:csb0="00040001" w:csb1="00000000"/>
-  </w:font>
-  <w:font w:name="Arial">
-    <w:panose1 w:val="020B0604020202020204"/>
-    <w:charset w:val="00"/>
-    <w:family w:val="swiss"/>
-    <w:pitch w:val="default"/>
-    <w:sig w:usb0="E0002EFF" w:usb1="C000785B" w:usb2="00000009" w:usb3="00000000" w:csb0="400001FF" w:csb1="FFFF0000"/>
-  </w:font>
-  <w:font w:name="黑体">
-    <w:altName w:val="SimSun"/>
-    <w:panose1 w:val="02010600030101010101"/>
-    <w:charset w:val="86"/>
-    <w:family w:val="auto"/>
-    <w:pitch w:val="default"/>
-    <w:sig w:usb0="00000001" w:usb1="080E0000" w:usb2="00000010" w:usb3="00000000" w:csb0="00040000" w:csb1="00000000"/>
-  </w:font>
-  <w:font w:name="Courier New">
-    <w:panose1 w:val="02070309020205020404"/>
-    <w:charset w:val="00"/>
-    <w:family w:val="modern"/>
-    <w:pitch w:val="default"/>
-    <w:sig w:usb0="E0002EFF" w:usb1="C0007843" w:usb2="00000009" w:usb3="00000000" w:csb0="400001FF" w:csb1="FFFF0000"/>
-  </w:font>
-  <w:font w:name="Wingdings">
-    <w:panose1 w:val="05000000000000000000"/>
-    <w:charset w:val="02"/>
-    <w:family w:val="auto"/>
-    <w:pitch w:val="default"/>
-    <w:sig w:usb0="00000000" w:usb1="00000000" w:usb2="00000000" w:usb3="00000000" w:csb0="80000000" w:csb1="00000000"/>
-  </w:font>
-  <w:font w:name="Calibri">
-    <w:panose1 w:val="020F0502020204030204"/>
-    <w:charset w:val="00"/>
-    <w:family w:val="swiss"/>
-    <w:pitch w:val="default"/>
-    <w:sig w:usb0="E4002EFF" w:usb1="C200247B" w:usb2="00000009" w:usb3="00000000" w:csb0="200001FF" w:csb1="00000000"/>
-  </w:font>
-  <w:font w:name="等线">
-    <w:altName w:val="Microsoft YaHei"/>
-    <w:panose1 w:val="00000000000000000000"/>
-    <w:charset w:val="86"/>
-    <w:family w:val="auto"/>
-    <w:pitch w:val="default"/>
-    <w:sig w:usb0="00000000" w:usb1="00000000" w:usb2="00000000" w:usb3="00000000" w:csb0="00000000" w:csb1="00000000"/>
-  </w:font>
-  <w:font w:name="VNI-Broad">
-    <w:altName w:val="Microsoft YaHei"/>
-    <w:panose1 w:val="00000000000000000000"/>
-    <w:charset w:val="00"/>
-    <w:family w:val="auto"/>
-    <w:pitch w:val="default"/>
-    <w:sig w:usb0="00000000" w:usb1="00000000" w:usb2="00000000" w:usb3="00000000" w:csb0="00000001" w:csb1="00000000"/>
-  </w:font>
-  <w:font w:name="Microsoft YaHei">
-    <w:panose1 w:val="020B0503020204020204"/>
-    <w:charset w:val="86"/>
-    <w:family w:val="swiss"/>
-    <w:pitch w:val="default"/>
-    <w:sig w:usb0="80000287" w:usb1="2ACF3C50" w:usb2="00000016" w:usb3="00000000" w:csb0="0004001F" w:csb1="00000000"/>
-  </w:font>
-  <w:font w:name="Cambria">
-    <w:panose1 w:val="02040503050406030204"/>
-    <w:charset w:val="00"/>
-    <w:family w:val="roman"/>
-    <w:pitch w:val="default"/>
-    <w:sig w:usb0="E00006FF" w:usb1="420024FF" w:usb2="02000000" w:usb3="00000000" w:csb0="2000019F" w:csb1="00000000"/>
-  </w:font>
-  <w:font w:name="MS Gothic">
-    <w:panose1 w:val="020B0609070205080204"/>
-    <w:charset w:val="80"/>
-    <w:family w:val="modern"/>
-    <w:pitch w:val="default"/>
-    <w:sig w:usb0="E00002FF" w:usb1="6AC7FDFB" w:usb2="08000012" w:usb3="00000000" w:csb0="4002009F" w:csb1="DFD70000"/>
-  </w:font>
-  <w:font w:name="Calibri Light">
-    <w:panose1 w:val="020F0302020204030204"/>
-    <w:charset w:val="00"/>
-    <w:family w:val="swiss"/>
-    <w:pitch w:val="default"/>
-    <w:sig w:usb0="E4002EFF" w:usb1="C200247B" w:usb2="00000009" w:usb3="00000000" w:csb0="200001FF" w:csb1="00000000"/>
-  </w:font>
-  <w:font w:name="等线 Light">
-    <w:altName w:val="Segoe Print"/>
-    <w:panose1 w:val="00000000000000000000"/>
-    <w:charset w:val="00"/>
-    <w:family w:val="auto"/>
-    <w:pitch w:val="default"/>
-    <w:sig w:usb0="00000000" w:usb1="00000000" w:usb2="00000000" w:usb3="00000000" w:csb0="00000000" w:csb1="00000000"/>
-  </w:font>
-  <w:font w:name="Segoe Print">
-    <w:panose1 w:val="02000600000000000000"/>
-    <w:charset w:val="00"/>
-    <w:family w:val="auto"/>
-    <w:pitch w:val="default"/>
-    <w:sig w:usb0="0000028F" w:usb1="00000000" w:usb2="00000000" w:usb3="00000000" w:csb0="2000009F" w:csb1="47010000"/>
-  </w:font>
-  <w:font w:name="MS Mincho">
-    <w:altName w:val="Yu Gothic UI"/>
-    <w:panose1 w:val="02020609040205080304"/>
-    <w:charset w:val="80"/>
-    <w:family w:val="modern"/>
-    <w:pitch w:val="default"/>
-    <w:sig w:usb0="00000000" w:usb1="00000000" w:usb2="08000012" w:usb3="00000000" w:csb0="0002009F" w:csb1="00000000"/>
-  </w:font>
-  <w:font w:name="Yu Gothic UI">
-    <w:panose1 w:val="020B0500000000000000"/>
-    <w:charset w:val="80"/>
-    <w:family w:val="auto"/>
-    <w:pitch w:val="default"/>
-    <w:sig w:usb0="E00002FF" w:usb1="2AC7FDFF" w:usb2="00000016" w:usb3="00000000" w:csb0="2002009F" w:csb1="00000000"/>
-  </w:font>
-  <w:font w:name="VNI-Avo">
-    <w:altName w:val="Microsoft YaHei"/>
-    <w:panose1 w:val="00000000000000000000"/>
-    <w:charset w:val="00"/>
-    <w:family w:val="auto"/>
-    <w:pitch w:val="default"/>
-    <w:sig w:usb0="00000000" w:usb1="00000000" w:usb2="00000000" w:usb3="00000000" w:csb0="00000001" w:csb1="00000000"/>
-  </w:font>
-  <w:font w:name="VNI-Times">
-    <w:altName w:val="Segoe Print"/>
-    <w:panose1 w:val="00000000000000000000"/>
-    <w:charset w:val="00"/>
-    <w:family w:val="auto"/>
-    <w:pitch w:val="default"/>
-    <w:sig w:usb0="00000000" w:usb1="00000000" w:usb2="00000000" w:usb3="00000000" w:csb0="00000013" w:csb1="00000000"/>
-  </w:font>
-  <w:font w:name="Symbol">
-    <w:panose1 w:val="05050102010706020507"/>
-    <w:charset w:val="02"/>
-    <w:family w:val="roman"/>
-    <w:pitch w:val="default"/>
-    <w:sig w:usb0="00000000" w:usb1="00000000" w:usb2="00000000" w:usb3="00000000" w:csb0="80000000" w:csb1="00000000"/>
-  </w:font>
-  <w:font w:name="TimesNewRomanPS-BoldMT">
-    <w:altName w:val="Segoe Print"/>
-    <w:panose1 w:val="00000000000000000000"/>
-    <w:charset w:val="00"/>
-    <w:family w:val="auto"/>
-    <w:pitch w:val="default"/>
-    <w:sig w:usb0="00000000" w:usb1="00000000" w:usb2="00000000" w:usb3="00000000" w:csb0="00000000" w:csb1="00000000"/>
-  </w:font>
-</w:fonts>
-</file>
-
-<file path=word\footer1.xml><?xml version="1.0" encoding="utf-8"?>
+<file path=word/footer1.xml><?xml version="1.0" encoding="utf-8"?>
 <w:ftr xmlns:wpc="http://schemas.microsoft.com/office/word/2010/wordprocessingCanvas" xmlns:mc="http://schemas.openxmlformats.org/markup-compatibility/2006" xmlns:o="urn:schemas-microsoft-com:office:office" xmlns:r="http://schemas.openxmlformats.org/officeDocument/2006/relationships" xmlns:m="http://schemas.openxmlformats.org/officeDocument/2006/math" xmlns:v="urn:schemas-microsoft-com:vml" xmlns:wp14="http://schemas.microsoft.com/office/word/2010/wordprocessingDrawing" xmlns:wp="http://schemas.openxmlformats.org/drawingml/2006/wordprocessingDrawing" xmlns:w10="urn:schemas-microsoft-com:office:word" xmlns:w="http://schemas.openxmlformats.org/wordprocessingml/2006/main" xmlns:w14="http://schemas.microsoft.com/office/word/2010/wordml" xmlns:w15="http://schemas.microsoft.com/office/word/2012/wordml" xmlns:wpg="http://schemas.microsoft.com/office/word/2010/wordprocessingGroup" xmlns:wpi="http://schemas.microsoft.com/office/word/2010/wordprocessingInk" xmlns:wne="http://schemas.microsoft.com/office/word/2006/wordml" xmlns:wps="http://schemas.microsoft.com/office/word/2010/wordprocessingShape" xmlns:wpsCustomData="http://www.wps.cn/officeDocument/2013/wpsCustomData" mc:Ignorable="w14 w15 wp14">
   <w:p>
     <w:pPr>
@@ -33973,7 +33772,7 @@
 </w:ftr>
 </file>
 
-<file path=word\numbering.xml><?xml version="1.0" encoding="utf-8"?>
+<file path=word/numbering.xml><?xml version="1.0" encoding="utf-8"?>
 <w:numbering xmlns:wpc="http://schemas.microsoft.com/office/word/2010/wordprocessingCanvas" xmlns:mc="http://schemas.openxmlformats.org/markup-compatibility/2006" xmlns:o="urn:schemas-microsoft-com:office:office" xmlns:r="http://schemas.openxmlformats.org/officeDocument/2006/relationships" xmlns:m="http://schemas.openxmlformats.org/officeDocument/2006/math" xmlns:v="urn:schemas-microsoft-com:vml" xmlns:wp14="http://schemas.microsoft.com/office/word/2010/wordprocessingDrawing" xmlns:wp="http://schemas.openxmlformats.org/drawingml/2006/wordprocessingDrawing" xmlns:w10="urn:schemas-microsoft-com:office:word" xmlns:w="http://schemas.openxmlformats.org/wordprocessingml/2006/main" xmlns:w14="http://schemas.microsoft.com/office/word/2010/wordml" xmlns:wpg="http://schemas.microsoft.com/office/word/2010/wordprocessingGroup" xmlns:wpi="http://schemas.microsoft.com/office/word/2010/wordprocessingInk" xmlns:wne="http://schemas.microsoft.com/office/word/2006/wordml" xmlns:wps="http://schemas.microsoft.com/office/word/2010/wordprocessingShape" xmlns:wpsCustomData="http://www.wps.cn/officeDocument/2013/wpsCustomData" mc:Ignorable="w14 wp14">
   <w:abstractNum w:abstractNumId="0">
     <w:nsid w:val="055660BF"/>
@@ -35434,1561 +35233,7 @@
 </w:numbering>
 </file>
 
-<file path=word\settings.xml><?xml version="1.0" encoding="utf-8"?>
-<w:settings xmlns:mc="http://schemas.openxmlformats.org/markup-compatibility/2006" xmlns:o="urn:schemas-microsoft-com:office:office" xmlns:r="http://schemas.openxmlformats.org/officeDocument/2006/relationships" xmlns:m="http://schemas.openxmlformats.org/officeDocument/2006/math" xmlns:v="urn:schemas-microsoft-com:vml" xmlns:w10="urn:schemas-microsoft-com:office:word" xmlns:w="http://schemas.openxmlformats.org/wordprocessingml/2006/main" xmlns:w14="http://schemas.microsoft.com/office/word/2010/wordml" xmlns:sl="http://schemas.openxmlformats.org/schemaLibrary/2006/main" xmlns:wpsCustomData="http://www.wps.cn/officeDocument/2013/wpsCustomData" mc:Ignorable="w14">
-  <w:zoom w:percent="150"/>
-  <w:embedSystemFonts/>
-  <w:bordersDoNotSurroundHeader w:val="0"/>
-  <w:bordersDoNotSurroundFooter w:val="0"/>
-  <w:documentProtection w:enforcement="0"/>
-  <w:defaultTabStop w:val="720"/>
-  <w:drawingGridVerticalSpacing w:val="156"/>
-  <w:displayHorizontalDrawingGridEvery w:val="0"/>
-  <w:displayVerticalDrawingGridEvery w:val="2"/>
-  <w:characterSpacingControl w:val="doNotCompress"/>
-  <w:compat>
-    <w:spaceForUL/>
-    <w:balanceSingleByteDoubleByteWidth/>
-    <w:doNotLeaveBackslashAlone/>
-    <w:ulTrailSpace/>
-    <w:doNotExpandShiftReturn/>
-    <w:adjustLineHeightInTable/>
-    <w:doNotWrapTextWithPunct/>
-    <w:doNotUseEastAsianBreakRules/>
-    <w:compatSetting w:name="compatibilityMode" w:uri="http://schemas.microsoft.com/office/word" w:val="14"/>
-    <w:compatSetting w:name="overrideTableStyleFontSizeAndJustification" w:uri="http://schemas.microsoft.com/office/word" w:val="1"/>
-    <w:compatSetting w:name="enableOpenTypeFeatures" w:uri="http://schemas.microsoft.com/office/word" w:val="1"/>
-    <w:compatSetting w:name="doNotFlipMirrorIndents" w:uri="http://schemas.microsoft.com/office/word" w:val="1"/>
-  </w:compat>
-  <w:rsids>
-    <w:rsidRoot w:val="3389018D"/>
-    <w:rsid w:val="00006E2E"/>
-    <w:rsid w:val="00011613"/>
-    <w:rsid w:val="00012D82"/>
-    <w:rsid w:val="00016410"/>
-    <w:rsid w:val="00030979"/>
-    <w:rsid w:val="0004780B"/>
-    <w:rsid w:val="00057634"/>
-    <w:rsid w:val="00061ED5"/>
-    <w:rsid w:val="00065901"/>
-    <w:rsid w:val="00072A3E"/>
-    <w:rsid w:val="000A2E62"/>
-    <w:rsid w:val="000B3C4A"/>
-    <w:rsid w:val="000B5A9C"/>
-    <w:rsid w:val="000B7688"/>
-    <w:rsid w:val="000E09D7"/>
-    <w:rsid w:val="000F5F5F"/>
-    <w:rsid w:val="00102468"/>
-    <w:rsid w:val="0010290F"/>
-    <w:rsid w:val="00123BA5"/>
-    <w:rsid w:val="00126EC0"/>
-    <w:rsid w:val="00130A5F"/>
-    <w:rsid w:val="00135760"/>
-    <w:rsid w:val="00135F36"/>
-    <w:rsid w:val="001413F5"/>
-    <w:rsid w:val="001541A5"/>
-    <w:rsid w:val="001662CD"/>
-    <w:rsid w:val="00167BC9"/>
-    <w:rsid w:val="00174C2F"/>
-    <w:rsid w:val="0017579D"/>
-    <w:rsid w:val="00177647"/>
-    <w:rsid w:val="00187D3A"/>
-    <w:rsid w:val="00192297"/>
-    <w:rsid w:val="001A0875"/>
-    <w:rsid w:val="001A633A"/>
-    <w:rsid w:val="001A7EBB"/>
-    <w:rsid w:val="001B5238"/>
-    <w:rsid w:val="001D1389"/>
-    <w:rsid w:val="001D627F"/>
-    <w:rsid w:val="001E79C3"/>
-    <w:rsid w:val="001F0E9E"/>
-    <w:rsid w:val="001F1115"/>
-    <w:rsid w:val="001F626C"/>
-    <w:rsid w:val="00216DF1"/>
-    <w:rsid w:val="00221B1F"/>
-    <w:rsid w:val="00226205"/>
-    <w:rsid w:val="00230988"/>
-    <w:rsid w:val="002321B7"/>
-    <w:rsid w:val="00234DA1"/>
-    <w:rsid w:val="00237B4A"/>
-    <w:rsid w:val="0024381E"/>
-    <w:rsid w:val="00253838"/>
-    <w:rsid w:val="0026038D"/>
-    <w:rsid w:val="0026208A"/>
-    <w:rsid w:val="002621E4"/>
-    <w:rsid w:val="00277B24"/>
-    <w:rsid w:val="00280277"/>
-    <w:rsid w:val="002807F3"/>
-    <w:rsid w:val="00284C22"/>
-    <w:rsid w:val="00294984"/>
-    <w:rsid w:val="002A20B3"/>
-    <w:rsid w:val="002A59F8"/>
-    <w:rsid w:val="002B4E76"/>
-    <w:rsid w:val="002C4117"/>
-    <w:rsid w:val="002C4B08"/>
-    <w:rsid w:val="002C5B73"/>
-    <w:rsid w:val="002C70DD"/>
-    <w:rsid w:val="003035E1"/>
-    <w:rsid w:val="00330B6D"/>
-    <w:rsid w:val="003316E8"/>
-    <w:rsid w:val="00333045"/>
-    <w:rsid w:val="00334578"/>
-    <w:rsid w:val="00340C57"/>
-    <w:rsid w:val="00344A86"/>
-    <w:rsid w:val="00354C8B"/>
-    <w:rsid w:val="003568EF"/>
-    <w:rsid w:val="00357C3B"/>
-    <w:rsid w:val="00390705"/>
-    <w:rsid w:val="003A0F81"/>
-    <w:rsid w:val="003A366E"/>
-    <w:rsid w:val="003A7C9C"/>
-    <w:rsid w:val="003B0AFE"/>
-    <w:rsid w:val="003B75A8"/>
-    <w:rsid w:val="003C5B3F"/>
-    <w:rsid w:val="003D6E42"/>
-    <w:rsid w:val="003D7230"/>
-    <w:rsid w:val="003E3A6C"/>
-    <w:rsid w:val="003E50AA"/>
-    <w:rsid w:val="003F7434"/>
-    <w:rsid w:val="00403415"/>
-    <w:rsid w:val="00403850"/>
-    <w:rsid w:val="00416302"/>
-    <w:rsid w:val="004174FE"/>
-    <w:rsid w:val="00447525"/>
-    <w:rsid w:val="0046718D"/>
-    <w:rsid w:val="00474A69"/>
-    <w:rsid w:val="00485780"/>
-    <w:rsid w:val="00494ADB"/>
-    <w:rsid w:val="00494B79"/>
-    <w:rsid w:val="004B6904"/>
-    <w:rsid w:val="004C0EA3"/>
-    <w:rsid w:val="004D5319"/>
-    <w:rsid w:val="004E2A7A"/>
-    <w:rsid w:val="004F2C0B"/>
-    <w:rsid w:val="004F3490"/>
-    <w:rsid w:val="004F6AEE"/>
-    <w:rsid w:val="00500353"/>
-    <w:rsid w:val="005052BF"/>
-    <w:rsid w:val="00513695"/>
-    <w:rsid w:val="0052049E"/>
-    <w:rsid w:val="0052124B"/>
-    <w:rsid w:val="0052302F"/>
-    <w:rsid w:val="00533334"/>
-    <w:rsid w:val="005363EC"/>
-    <w:rsid w:val="005402EB"/>
-    <w:rsid w:val="00552A63"/>
-    <w:rsid w:val="005637B2"/>
-    <w:rsid w:val="00570047"/>
-    <w:rsid w:val="00581016"/>
-    <w:rsid w:val="005918A2"/>
-    <w:rsid w:val="00591B88"/>
-    <w:rsid w:val="005B5E42"/>
-    <w:rsid w:val="005B7867"/>
-    <w:rsid w:val="005E3566"/>
-    <w:rsid w:val="005E7325"/>
-    <w:rsid w:val="005F60ED"/>
-    <w:rsid w:val="006001B5"/>
-    <w:rsid w:val="00602EF0"/>
-    <w:rsid w:val="006046F9"/>
-    <w:rsid w:val="00626BE4"/>
-    <w:rsid w:val="006418DB"/>
-    <w:rsid w:val="006532F3"/>
-    <w:rsid w:val="006549D7"/>
-    <w:rsid w:val="0066547C"/>
-    <w:rsid w:val="006657C9"/>
-    <w:rsid w:val="00671065"/>
-    <w:rsid w:val="00673FA6"/>
-    <w:rsid w:val="00674381"/>
-    <w:rsid w:val="00676759"/>
-    <w:rsid w:val="006803C1"/>
-    <w:rsid w:val="006909FA"/>
-    <w:rsid w:val="00693FCB"/>
-    <w:rsid w:val="00696666"/>
-    <w:rsid w:val="006A63D8"/>
-    <w:rsid w:val="006B09BB"/>
-    <w:rsid w:val="006D3ACF"/>
-    <w:rsid w:val="006D4645"/>
-    <w:rsid w:val="006E1356"/>
-    <w:rsid w:val="007014A9"/>
-    <w:rsid w:val="00701931"/>
-    <w:rsid w:val="00713B60"/>
-    <w:rsid w:val="00716B27"/>
-    <w:rsid w:val="0072653F"/>
-    <w:rsid w:val="00726AD7"/>
-    <w:rsid w:val="007318C3"/>
-    <w:rsid w:val="007539F5"/>
-    <w:rsid w:val="00766FCE"/>
-    <w:rsid w:val="00792CB2"/>
-    <w:rsid w:val="0079453A"/>
-    <w:rsid w:val="007A0025"/>
-    <w:rsid w:val="007A568E"/>
-    <w:rsid w:val="007A7655"/>
-    <w:rsid w:val="007B25B3"/>
-    <w:rsid w:val="007B3165"/>
-    <w:rsid w:val="007B5500"/>
-    <w:rsid w:val="007B6A57"/>
-    <w:rsid w:val="007C0581"/>
-    <w:rsid w:val="007C768C"/>
-    <w:rsid w:val="007D3FEE"/>
-    <w:rsid w:val="007E5737"/>
-    <w:rsid w:val="0080338F"/>
-    <w:rsid w:val="00810EB6"/>
-    <w:rsid w:val="00812A7C"/>
-    <w:rsid w:val="008163FC"/>
-    <w:rsid w:val="00825D23"/>
-    <w:rsid w:val="00837AE5"/>
-    <w:rsid w:val="00837FD2"/>
-    <w:rsid w:val="00842719"/>
-    <w:rsid w:val="00847F11"/>
-    <w:rsid w:val="008673E1"/>
-    <w:rsid w:val="0086774A"/>
-    <w:rsid w:val="00876183"/>
-    <w:rsid w:val="0088514A"/>
-    <w:rsid w:val="00886485"/>
-    <w:rsid w:val="00891931"/>
-    <w:rsid w:val="00894DA6"/>
-    <w:rsid w:val="008A6C82"/>
-    <w:rsid w:val="008A764C"/>
-    <w:rsid w:val="008B096F"/>
-    <w:rsid w:val="008B5BF9"/>
-    <w:rsid w:val="008B738E"/>
-    <w:rsid w:val="008C2F47"/>
-    <w:rsid w:val="008D058F"/>
-    <w:rsid w:val="008D2846"/>
-    <w:rsid w:val="008D6FF2"/>
-    <w:rsid w:val="008F323C"/>
-    <w:rsid w:val="009100E9"/>
-    <w:rsid w:val="00910BFB"/>
-    <w:rsid w:val="00911E67"/>
-    <w:rsid w:val="00917C41"/>
-    <w:rsid w:val="00921076"/>
-    <w:rsid w:val="0092493D"/>
-    <w:rsid w:val="00927120"/>
-    <w:rsid w:val="009422C2"/>
-    <w:rsid w:val="0094318C"/>
-    <w:rsid w:val="00943B7C"/>
-    <w:rsid w:val="00944FDB"/>
-    <w:rsid w:val="00950821"/>
-    <w:rsid w:val="00952607"/>
-    <w:rsid w:val="00953A75"/>
-    <w:rsid w:val="00957EE9"/>
-    <w:rsid w:val="009641F4"/>
-    <w:rsid w:val="009655BE"/>
-    <w:rsid w:val="00967AEE"/>
-    <w:rsid w:val="00971642"/>
-    <w:rsid w:val="0097170A"/>
-    <w:rsid w:val="009A6608"/>
-    <w:rsid w:val="009B7BEE"/>
-    <w:rsid w:val="009C1A9D"/>
-    <w:rsid w:val="009C3F71"/>
-    <w:rsid w:val="009C4A41"/>
-    <w:rsid w:val="009C68FD"/>
-    <w:rsid w:val="009C6EA6"/>
-    <w:rsid w:val="009C7AE3"/>
-    <w:rsid w:val="009D0490"/>
-    <w:rsid w:val="009D3B44"/>
-    <w:rsid w:val="009E709D"/>
-    <w:rsid w:val="009F359D"/>
-    <w:rsid w:val="00A02B55"/>
-    <w:rsid w:val="00A15893"/>
-    <w:rsid w:val="00A16FBD"/>
-    <w:rsid w:val="00A24D69"/>
-    <w:rsid w:val="00A303FB"/>
-    <w:rsid w:val="00A34830"/>
-    <w:rsid w:val="00A52183"/>
-    <w:rsid w:val="00A6105E"/>
-    <w:rsid w:val="00A620E6"/>
-    <w:rsid w:val="00A74704"/>
-    <w:rsid w:val="00A7797B"/>
-    <w:rsid w:val="00A802EE"/>
-    <w:rsid w:val="00A80820"/>
-    <w:rsid w:val="00A860A1"/>
-    <w:rsid w:val="00AB3E8D"/>
-    <w:rsid w:val="00AC0160"/>
-    <w:rsid w:val="00AC55BA"/>
-    <w:rsid w:val="00AD1AA6"/>
-    <w:rsid w:val="00AD5E81"/>
-    <w:rsid w:val="00AE4AFE"/>
-    <w:rsid w:val="00AE7187"/>
-    <w:rsid w:val="00B07AD7"/>
-    <w:rsid w:val="00B1220C"/>
-    <w:rsid w:val="00B20CDE"/>
-    <w:rsid w:val="00B309F9"/>
-    <w:rsid w:val="00B30D35"/>
-    <w:rsid w:val="00B33893"/>
-    <w:rsid w:val="00B348A8"/>
-    <w:rsid w:val="00B36994"/>
-    <w:rsid w:val="00B40BBF"/>
-    <w:rsid w:val="00B46490"/>
-    <w:rsid w:val="00B50FA7"/>
-    <w:rsid w:val="00B52B66"/>
-    <w:rsid w:val="00B55BB1"/>
-    <w:rsid w:val="00B73929"/>
-    <w:rsid w:val="00B80FBA"/>
-    <w:rsid w:val="00B90ACB"/>
-    <w:rsid w:val="00B93026"/>
-    <w:rsid w:val="00B94BCD"/>
-    <w:rsid w:val="00BB1858"/>
-    <w:rsid w:val="00BC17B8"/>
-    <w:rsid w:val="00BC182B"/>
-    <w:rsid w:val="00BD142A"/>
-    <w:rsid w:val="00BE6247"/>
-    <w:rsid w:val="00C0121F"/>
-    <w:rsid w:val="00C37FE3"/>
-    <w:rsid w:val="00C42539"/>
-    <w:rsid w:val="00C42D39"/>
-    <w:rsid w:val="00C47514"/>
-    <w:rsid w:val="00C51217"/>
-    <w:rsid w:val="00C528C5"/>
-    <w:rsid w:val="00C67AF2"/>
-    <w:rsid w:val="00C73896"/>
-    <w:rsid w:val="00C74A4E"/>
-    <w:rsid w:val="00C74E81"/>
-    <w:rsid w:val="00C74F8A"/>
-    <w:rsid w:val="00C822F3"/>
-    <w:rsid w:val="00C86ABF"/>
-    <w:rsid w:val="00C8708F"/>
-    <w:rsid w:val="00C93D19"/>
-    <w:rsid w:val="00C9478D"/>
-    <w:rsid w:val="00CA6611"/>
-    <w:rsid w:val="00CB0374"/>
-    <w:rsid w:val="00CC0F48"/>
-    <w:rsid w:val="00CC2672"/>
-    <w:rsid w:val="00CC5D98"/>
-    <w:rsid w:val="00CC7CB0"/>
-    <w:rsid w:val="00CE3769"/>
-    <w:rsid w:val="00CE7320"/>
-    <w:rsid w:val="00CE7B29"/>
-    <w:rsid w:val="00D02A76"/>
-    <w:rsid w:val="00D05A21"/>
-    <w:rsid w:val="00D06470"/>
-    <w:rsid w:val="00D0652D"/>
-    <w:rsid w:val="00D10133"/>
-    <w:rsid w:val="00D136F4"/>
-    <w:rsid w:val="00D16544"/>
-    <w:rsid w:val="00D22F9A"/>
-    <w:rsid w:val="00D260A7"/>
-    <w:rsid w:val="00D42CEC"/>
-    <w:rsid w:val="00D46C32"/>
-    <w:rsid w:val="00D541D4"/>
-    <w:rsid w:val="00D54C58"/>
-    <w:rsid w:val="00D5643D"/>
-    <w:rsid w:val="00D5699F"/>
-    <w:rsid w:val="00D60239"/>
-    <w:rsid w:val="00D768D6"/>
-    <w:rsid w:val="00D8045A"/>
-    <w:rsid w:val="00D8440C"/>
-    <w:rsid w:val="00DA4223"/>
-    <w:rsid w:val="00DA4FBD"/>
-    <w:rsid w:val="00DA5EC3"/>
-    <w:rsid w:val="00DC32CB"/>
-    <w:rsid w:val="00DD09CD"/>
-    <w:rsid w:val="00DE07EC"/>
-    <w:rsid w:val="00DF1FE7"/>
-    <w:rsid w:val="00DF5C49"/>
-    <w:rsid w:val="00DF6337"/>
-    <w:rsid w:val="00E03731"/>
-    <w:rsid w:val="00E04342"/>
-    <w:rsid w:val="00E151E6"/>
-    <w:rsid w:val="00E276E7"/>
-    <w:rsid w:val="00E34D65"/>
-    <w:rsid w:val="00E3517C"/>
-    <w:rsid w:val="00E63AE3"/>
-    <w:rsid w:val="00E67E09"/>
-    <w:rsid w:val="00E71003"/>
-    <w:rsid w:val="00E71960"/>
-    <w:rsid w:val="00E772FF"/>
-    <w:rsid w:val="00E813BD"/>
-    <w:rsid w:val="00E82BC7"/>
-    <w:rsid w:val="00E83712"/>
-    <w:rsid w:val="00E92FC1"/>
-    <w:rsid w:val="00E935FF"/>
-    <w:rsid w:val="00EA02AA"/>
-    <w:rsid w:val="00EA26A2"/>
-    <w:rsid w:val="00EA5D9E"/>
-    <w:rsid w:val="00EB6295"/>
-    <w:rsid w:val="00EC5423"/>
-    <w:rsid w:val="00EC7F11"/>
-    <w:rsid w:val="00ED5584"/>
-    <w:rsid w:val="00ED576F"/>
-    <w:rsid w:val="00EE1739"/>
-    <w:rsid w:val="00F11316"/>
-    <w:rsid w:val="00F120BF"/>
-    <w:rsid w:val="00F22D9E"/>
-    <w:rsid w:val="00F23446"/>
-    <w:rsid w:val="00F2467A"/>
-    <w:rsid w:val="00F255AA"/>
-    <w:rsid w:val="00F30099"/>
-    <w:rsid w:val="00F320E0"/>
-    <w:rsid w:val="00F33427"/>
-    <w:rsid w:val="00F400DE"/>
-    <w:rsid w:val="00F46559"/>
-    <w:rsid w:val="00F47F21"/>
-    <w:rsid w:val="00F53CA5"/>
-    <w:rsid w:val="00F639BE"/>
-    <w:rsid w:val="00F64CA3"/>
-    <w:rsid w:val="00F663A1"/>
-    <w:rsid w:val="00F81BD8"/>
-    <w:rsid w:val="00F860F7"/>
-    <w:rsid w:val="00F91758"/>
-    <w:rsid w:val="00F93014"/>
-    <w:rsid w:val="00F94D56"/>
-    <w:rsid w:val="00FA5346"/>
-    <w:rsid w:val="00FA6FD7"/>
-    <w:rsid w:val="00FC3572"/>
-    <w:rsid w:val="00FD01B5"/>
-    <w:rsid w:val="00FE14B0"/>
-    <w:rsid w:val="013019FE"/>
-    <w:rsid w:val="016B1BE3"/>
-    <w:rsid w:val="01785675"/>
-    <w:rsid w:val="019E18DE"/>
-    <w:rsid w:val="01BB4E65"/>
-    <w:rsid w:val="01C979FE"/>
-    <w:rsid w:val="01DF6F78"/>
-    <w:rsid w:val="02241011"/>
-    <w:rsid w:val="023006A7"/>
-    <w:rsid w:val="02315AA6"/>
-    <w:rsid w:val="023E1BBB"/>
-    <w:rsid w:val="024A1BCC"/>
-    <w:rsid w:val="026B1786"/>
-    <w:rsid w:val="02842C5B"/>
-    <w:rsid w:val="028E2C3F"/>
-    <w:rsid w:val="02A200CC"/>
-    <w:rsid w:val="02C31E14"/>
-    <w:rsid w:val="03713101"/>
-    <w:rsid w:val="03867B41"/>
-    <w:rsid w:val="03C377B9"/>
-    <w:rsid w:val="03D17DD3"/>
-    <w:rsid w:val="03F04E05"/>
-    <w:rsid w:val="03F35278"/>
-    <w:rsid w:val="03F97C93"/>
-    <w:rsid w:val="041A146A"/>
-    <w:rsid w:val="04343783"/>
-    <w:rsid w:val="04377778"/>
-    <w:rsid w:val="04556D28"/>
-    <w:rsid w:val="046F3155"/>
-    <w:rsid w:val="048B7202"/>
-    <w:rsid w:val="04906F0D"/>
-    <w:rsid w:val="04A515D1"/>
-    <w:rsid w:val="04AB3659"/>
-    <w:rsid w:val="04AC7736"/>
-    <w:rsid w:val="04DE120A"/>
-    <w:rsid w:val="04E0470D"/>
-    <w:rsid w:val="04F77BB6"/>
-    <w:rsid w:val="053319A4"/>
-    <w:rsid w:val="05451CFB"/>
-    <w:rsid w:val="055F2A5D"/>
-    <w:rsid w:val="05E912CD"/>
-    <w:rsid w:val="05ED4B49"/>
-    <w:rsid w:val="05EE1047"/>
-    <w:rsid w:val="05F56058"/>
-    <w:rsid w:val="060A437D"/>
-    <w:rsid w:val="060E737E"/>
-    <w:rsid w:val="06112BE7"/>
-    <w:rsid w:val="061F3288"/>
-    <w:rsid w:val="061F7618"/>
-    <w:rsid w:val="06431DD6"/>
-    <w:rsid w:val="06744B24"/>
-    <w:rsid w:val="06813E39"/>
-    <w:rsid w:val="06A35673"/>
-    <w:rsid w:val="06A52D74"/>
-    <w:rsid w:val="06C248A3"/>
-    <w:rsid w:val="06CA5532"/>
-    <w:rsid w:val="06E076D6"/>
-    <w:rsid w:val="07580619"/>
-    <w:rsid w:val="076034A7"/>
-    <w:rsid w:val="076334A9"/>
-    <w:rsid w:val="078139DC"/>
-    <w:rsid w:val="078432FC"/>
-    <w:rsid w:val="078E2CF2"/>
-    <w:rsid w:val="07A26837"/>
-    <w:rsid w:val="07B62D5A"/>
-    <w:rsid w:val="07D53466"/>
-    <w:rsid w:val="080A3F6D"/>
-    <w:rsid w:val="081D70DE"/>
-    <w:rsid w:val="08633FCF"/>
-    <w:rsid w:val="087F75EA"/>
-    <w:rsid w:val="08AF0683"/>
-    <w:rsid w:val="08E20120"/>
-    <w:rsid w:val="091A3212"/>
-    <w:rsid w:val="095007F3"/>
-    <w:rsid w:val="09510D55"/>
-    <w:rsid w:val="09627775"/>
-    <w:rsid w:val="09D873B4"/>
-    <w:rsid w:val="09E129C6"/>
-    <w:rsid w:val="0A345E8D"/>
-    <w:rsid w:val="0A5A6688"/>
-    <w:rsid w:val="0A600591"/>
-    <w:rsid w:val="0A8E0942"/>
-    <w:rsid w:val="0AA85C88"/>
-    <w:rsid w:val="0ABA229F"/>
-    <w:rsid w:val="0AC6703C"/>
-    <w:rsid w:val="0B01011B"/>
-    <w:rsid w:val="0B1600C0"/>
-    <w:rsid w:val="0B7E67EB"/>
-    <w:rsid w:val="0BAC05B3"/>
-    <w:rsid w:val="0BBC40D1"/>
-    <w:rsid w:val="0BC820E2"/>
-    <w:rsid w:val="0BDA3681"/>
-    <w:rsid w:val="0BE92617"/>
-    <w:rsid w:val="0BFC7A81"/>
-    <w:rsid w:val="0C1F2AF1"/>
-    <w:rsid w:val="0C3E33A6"/>
-    <w:rsid w:val="0C5D2505"/>
-    <w:rsid w:val="0C6F3B75"/>
-    <w:rsid w:val="0C6F7B8A"/>
-    <w:rsid w:val="0CC45C57"/>
-    <w:rsid w:val="0D12337E"/>
-    <w:rsid w:val="0D1C170F"/>
-    <w:rsid w:val="0D23109A"/>
-    <w:rsid w:val="0D2658A2"/>
-    <w:rsid w:val="0D4870DB"/>
-    <w:rsid w:val="0D68630B"/>
-    <w:rsid w:val="0D755621"/>
-    <w:rsid w:val="0DE15FD5"/>
-    <w:rsid w:val="0E4946FF"/>
-    <w:rsid w:val="0E5724EC"/>
-    <w:rsid w:val="0E8E1971"/>
-    <w:rsid w:val="0E922575"/>
-    <w:rsid w:val="0EE36E7C"/>
-    <w:rsid w:val="0F2862EC"/>
-    <w:rsid w:val="0F295F6C"/>
-    <w:rsid w:val="0F3E048F"/>
-    <w:rsid w:val="0F562EA9"/>
-    <w:rsid w:val="0F6C7CDA"/>
-    <w:rsid w:val="0F794DF1"/>
-    <w:rsid w:val="0F7D40A6"/>
-    <w:rsid w:val="0FBD0540"/>
-    <w:rsid w:val="0FFA66E1"/>
-    <w:rsid w:val="1015177C"/>
-    <w:rsid w:val="10330CA8"/>
-    <w:rsid w:val="10331EC4"/>
-    <w:rsid w:val="104550C0"/>
-    <w:rsid w:val="10534754"/>
-    <w:rsid w:val="107D6700"/>
-    <w:rsid w:val="10864871"/>
-    <w:rsid w:val="109072EE"/>
-    <w:rsid w:val="10957190"/>
-    <w:rsid w:val="109C7872"/>
-    <w:rsid w:val="10AE73EC"/>
-    <w:rsid w:val="10B028F0"/>
-    <w:rsid w:val="10E44043"/>
-    <w:rsid w:val="10FC16EA"/>
-    <w:rsid w:val="11051FFA"/>
-    <w:rsid w:val="11076F28"/>
-    <w:rsid w:val="112D573C"/>
-    <w:rsid w:val="11581E04"/>
-    <w:rsid w:val="115931FE"/>
-    <w:rsid w:val="118C0D46"/>
-    <w:rsid w:val="1190415C"/>
-    <w:rsid w:val="11A17C7A"/>
-    <w:rsid w:val="11AB600B"/>
-    <w:rsid w:val="11B4471C"/>
-    <w:rsid w:val="11BB0823"/>
-    <w:rsid w:val="11C336B1"/>
-    <w:rsid w:val="11E164E5"/>
-    <w:rsid w:val="11E6296C"/>
-    <w:rsid w:val="120D282C"/>
-    <w:rsid w:val="123B7E78"/>
-    <w:rsid w:val="123F687E"/>
-    <w:rsid w:val="12460407"/>
-    <w:rsid w:val="124D7D92"/>
-    <w:rsid w:val="12562F60"/>
-    <w:rsid w:val="125B4B29"/>
-    <w:rsid w:val="12857AB0"/>
-    <w:rsid w:val="128E2C19"/>
-    <w:rsid w:val="12C15B53"/>
-    <w:rsid w:val="12EC7C9C"/>
-    <w:rsid w:val="12F20183"/>
-    <w:rsid w:val="12F91530"/>
-    <w:rsid w:val="132248F2"/>
-    <w:rsid w:val="1347382D"/>
-    <w:rsid w:val="136048D3"/>
-    <w:rsid w:val="136D5C6B"/>
-    <w:rsid w:val="136E49CD"/>
-    <w:rsid w:val="13872098"/>
-    <w:rsid w:val="13FA6B54"/>
-    <w:rsid w:val="140838EB"/>
-    <w:rsid w:val="142C4DA5"/>
-    <w:rsid w:val="142D7A74"/>
-    <w:rsid w:val="143B2E41"/>
-    <w:rsid w:val="147F2631"/>
-    <w:rsid w:val="14871A82"/>
-    <w:rsid w:val="14A26068"/>
-    <w:rsid w:val="14AD65F8"/>
-    <w:rsid w:val="14D13334"/>
-    <w:rsid w:val="14DB16C5"/>
-    <w:rsid w:val="14DC7147"/>
-    <w:rsid w:val="14F078F4"/>
-    <w:rsid w:val="1505030B"/>
-    <w:rsid w:val="15051864"/>
-    <w:rsid w:val="1507380E"/>
-    <w:rsid w:val="151B539B"/>
-    <w:rsid w:val="15250840"/>
-    <w:rsid w:val="152D5C4C"/>
-    <w:rsid w:val="15441D99"/>
-    <w:rsid w:val="156F115E"/>
-    <w:rsid w:val="156F36B5"/>
-    <w:rsid w:val="1573093F"/>
-    <w:rsid w:val="15906555"/>
-    <w:rsid w:val="15B06226"/>
-    <w:rsid w:val="15D1675A"/>
-    <w:rsid w:val="15FA1B1D"/>
-    <w:rsid w:val="165D2DF0"/>
-    <w:rsid w:val="166127C6"/>
-    <w:rsid w:val="16757268"/>
-    <w:rsid w:val="16A022AB"/>
-    <w:rsid w:val="16A56732"/>
-    <w:rsid w:val="16CC7805"/>
-    <w:rsid w:val="1722157F"/>
-    <w:rsid w:val="17263809"/>
-    <w:rsid w:val="172E6F69"/>
-    <w:rsid w:val="176A51F7"/>
-    <w:rsid w:val="177F1919"/>
-    <w:rsid w:val="1783031F"/>
-    <w:rsid w:val="17876D25"/>
-    <w:rsid w:val="17A056D1"/>
-    <w:rsid w:val="17A12726"/>
-    <w:rsid w:val="17B0376D"/>
-    <w:rsid w:val="17F96E28"/>
-    <w:rsid w:val="18040F21"/>
-    <w:rsid w:val="181D547A"/>
-    <w:rsid w:val="18235CAA"/>
-    <w:rsid w:val="182C5A12"/>
-    <w:rsid w:val="183171BE"/>
-    <w:rsid w:val="18481362"/>
-    <w:rsid w:val="18833745"/>
-    <w:rsid w:val="18A90101"/>
-    <w:rsid w:val="18C663ED"/>
-    <w:rsid w:val="193F18FA"/>
-    <w:rsid w:val="197D395D"/>
-    <w:rsid w:val="19AB482C"/>
-    <w:rsid w:val="19C419F8"/>
-    <w:rsid w:val="19D44818"/>
-    <w:rsid w:val="19DB757A"/>
-    <w:rsid w:val="1A0A07AA"/>
-    <w:rsid w:val="1A111C52"/>
-    <w:rsid w:val="1A12783D"/>
-    <w:rsid w:val="1A273DF6"/>
-    <w:rsid w:val="1A5039CB"/>
-    <w:rsid w:val="1A830C8C"/>
-    <w:rsid w:val="1A9B1BBC"/>
-    <w:rsid w:val="1AA0603E"/>
-    <w:rsid w:val="1AA90ECC"/>
-    <w:rsid w:val="1AD55213"/>
-    <w:rsid w:val="1B165C7C"/>
-    <w:rsid w:val="1B435847"/>
-    <w:rsid w:val="1B5E5BB2"/>
-    <w:rsid w:val="1B5E76F6"/>
-    <w:rsid w:val="1BC03F17"/>
-    <w:rsid w:val="1BC90FA3"/>
-    <w:rsid w:val="1BC975B0"/>
-    <w:rsid w:val="1BDA123E"/>
-    <w:rsid w:val="1BF60B6E"/>
-    <w:rsid w:val="1BFF39FC"/>
-    <w:rsid w:val="1C2361BA"/>
-    <w:rsid w:val="1C363406"/>
-    <w:rsid w:val="1C803DCB"/>
-    <w:rsid w:val="1CC80EC6"/>
-    <w:rsid w:val="1CF56512"/>
-    <w:rsid w:val="1D245D5D"/>
-    <w:rsid w:val="1D297C66"/>
-    <w:rsid w:val="1D306EC4"/>
-    <w:rsid w:val="1D330575"/>
-    <w:rsid w:val="1D6A64D1"/>
-    <w:rsid w:val="1D6D3BD2"/>
-    <w:rsid w:val="1D985D1B"/>
-    <w:rsid w:val="1DAB1184"/>
-    <w:rsid w:val="1DB652CB"/>
-    <w:rsid w:val="1DB96250"/>
-    <w:rsid w:val="1DBF39DD"/>
-    <w:rsid w:val="1E061BD3"/>
-    <w:rsid w:val="1E1B62F5"/>
-    <w:rsid w:val="1E253381"/>
-    <w:rsid w:val="1E942391"/>
-    <w:rsid w:val="1EBA3111"/>
-    <w:rsid w:val="1EC91910"/>
-    <w:rsid w:val="1F2B4F5C"/>
-    <w:rsid w:val="1F5A11FF"/>
-    <w:rsid w:val="1FB05A18"/>
-    <w:rsid w:val="1FC73DB2"/>
-    <w:rsid w:val="2025634A"/>
-    <w:rsid w:val="20294D50"/>
-    <w:rsid w:val="208E24F6"/>
-    <w:rsid w:val="20AD7527"/>
-    <w:rsid w:val="20D83089"/>
-    <w:rsid w:val="20ED3B94"/>
-    <w:rsid w:val="20FF3AAE"/>
-    <w:rsid w:val="210A78C1"/>
-    <w:rsid w:val="210C6647"/>
-    <w:rsid w:val="21244601"/>
-    <w:rsid w:val="215F4DCD"/>
-    <w:rsid w:val="216A0F4D"/>
-    <w:rsid w:val="21983295"/>
-    <w:rsid w:val="21A76846"/>
-    <w:rsid w:val="21E32E28"/>
-    <w:rsid w:val="220B2CE7"/>
-    <w:rsid w:val="221A5500"/>
-    <w:rsid w:val="22214E8B"/>
-    <w:rsid w:val="223B5A35"/>
-    <w:rsid w:val="229E7CD7"/>
-    <w:rsid w:val="22A266DE"/>
-    <w:rsid w:val="22B91B86"/>
-    <w:rsid w:val="22D92E1E"/>
-    <w:rsid w:val="2305432C"/>
-    <w:rsid w:val="230B610D"/>
-    <w:rsid w:val="23370256"/>
-    <w:rsid w:val="23536501"/>
-    <w:rsid w:val="2377323E"/>
-    <w:rsid w:val="239462AE"/>
-    <w:rsid w:val="239A46F7"/>
-    <w:rsid w:val="23A75F8B"/>
-    <w:rsid w:val="23BE2559"/>
-    <w:rsid w:val="23C245B7"/>
-    <w:rsid w:val="242023D2"/>
-    <w:rsid w:val="24304BEB"/>
-    <w:rsid w:val="24696049"/>
-    <w:rsid w:val="247C7268"/>
-    <w:rsid w:val="249D521F"/>
-    <w:rsid w:val="24CF1271"/>
-    <w:rsid w:val="24DB1B65"/>
-    <w:rsid w:val="24F2052C"/>
-    <w:rsid w:val="24F301AC"/>
-    <w:rsid w:val="250A7DD1"/>
-    <w:rsid w:val="250D0270"/>
-    <w:rsid w:val="2536579D"/>
-    <w:rsid w:val="255C4FCB"/>
-    <w:rsid w:val="255E785B"/>
-    <w:rsid w:val="2564254A"/>
-    <w:rsid w:val="25AE08DF"/>
-    <w:rsid w:val="25B96C70"/>
-    <w:rsid w:val="25C25381"/>
-    <w:rsid w:val="25C97518"/>
-    <w:rsid w:val="25DF10AE"/>
-    <w:rsid w:val="260E79FF"/>
-    <w:rsid w:val="261A695C"/>
-    <w:rsid w:val="266425F2"/>
-    <w:rsid w:val="2671641F"/>
-    <w:rsid w:val="267C1FE9"/>
-    <w:rsid w:val="268D2FF6"/>
-    <w:rsid w:val="26B07208"/>
-    <w:rsid w:val="26B551EB"/>
-    <w:rsid w:val="26B9770A"/>
-    <w:rsid w:val="26D43AA3"/>
-    <w:rsid w:val="27544493"/>
-    <w:rsid w:val="276163FB"/>
-    <w:rsid w:val="276A4438"/>
-    <w:rsid w:val="27853DB3"/>
-    <w:rsid w:val="279D5B8C"/>
-    <w:rsid w:val="27B222AE"/>
-    <w:rsid w:val="27BA54BC"/>
-    <w:rsid w:val="27D22B63"/>
-    <w:rsid w:val="27DE43F7"/>
-    <w:rsid w:val="27E53D82"/>
-    <w:rsid w:val="27EF4E26"/>
-    <w:rsid w:val="28143812"/>
-    <w:rsid w:val="282D4176"/>
-    <w:rsid w:val="283205FE"/>
-    <w:rsid w:val="28387F89"/>
-    <w:rsid w:val="28474D20"/>
-    <w:rsid w:val="28980D81"/>
-    <w:rsid w:val="28D82090"/>
-    <w:rsid w:val="28DE103A"/>
-    <w:rsid w:val="28E4267B"/>
-    <w:rsid w:val="28EE1C21"/>
-    <w:rsid w:val="28F95E48"/>
-    <w:rsid w:val="292331DD"/>
-    <w:rsid w:val="29305804"/>
-    <w:rsid w:val="29334D29"/>
-    <w:rsid w:val="293409E7"/>
-    <w:rsid w:val="293811B0"/>
-    <w:rsid w:val="29423CBE"/>
-    <w:rsid w:val="29763213"/>
-    <w:rsid w:val="2A213CC4"/>
-    <w:rsid w:val="2A257B34"/>
-    <w:rsid w:val="2A2E4BC0"/>
-    <w:rsid w:val="2A3B1CD8"/>
-    <w:rsid w:val="2A6D37AC"/>
-    <w:rsid w:val="2AA42601"/>
-    <w:rsid w:val="2AA45E84"/>
-    <w:rsid w:val="2AB73F28"/>
-    <w:rsid w:val="2ABD0FAC"/>
-    <w:rsid w:val="2C291503"/>
-    <w:rsid w:val="2C2B40DB"/>
-    <w:rsid w:val="2C395810"/>
-    <w:rsid w:val="2C493FB6"/>
-    <w:rsid w:val="2C560482"/>
-    <w:rsid w:val="2C5A1CD2"/>
-    <w:rsid w:val="2C6C546F"/>
-    <w:rsid w:val="2C701C77"/>
-    <w:rsid w:val="2C734DFA"/>
-    <w:rsid w:val="2C852B16"/>
-    <w:rsid w:val="2CAE175C"/>
-    <w:rsid w:val="2D1858EE"/>
-    <w:rsid w:val="2D4C4ADE"/>
-    <w:rsid w:val="2D5034E4"/>
-    <w:rsid w:val="2DAF1925"/>
-    <w:rsid w:val="2DC931AE"/>
-    <w:rsid w:val="2DED4667"/>
-    <w:rsid w:val="2E0F5EA0"/>
-    <w:rsid w:val="2E1D73B4"/>
-    <w:rsid w:val="2E262242"/>
-    <w:rsid w:val="2E421B72"/>
-    <w:rsid w:val="2E5C1A7F"/>
-    <w:rsid w:val="2E7D5726"/>
-    <w:rsid w:val="2E8848A3"/>
-    <w:rsid w:val="2E8D4175"/>
-    <w:rsid w:val="2E953B7B"/>
-    <w:rsid w:val="2EEB1750"/>
-    <w:rsid w:val="2EED296D"/>
-    <w:rsid w:val="2EF23404"/>
-    <w:rsid w:val="2EF36113"/>
-    <w:rsid w:val="2F02092C"/>
-    <w:rsid w:val="2F0B703D"/>
-    <w:rsid w:val="2F45269A"/>
-    <w:rsid w:val="2F5F3244"/>
-    <w:rsid w:val="2F796ED7"/>
-    <w:rsid w:val="2FB36551"/>
-    <w:rsid w:val="2FB53A8B"/>
-    <w:rsid w:val="2FBE2364"/>
-    <w:rsid w:val="2FFF0BCF"/>
-    <w:rsid w:val="30067887"/>
-    <w:rsid w:val="301452F1"/>
-    <w:rsid w:val="304170BA"/>
-    <w:rsid w:val="30470FC3"/>
-    <w:rsid w:val="304B79C9"/>
-    <w:rsid w:val="305A21E2"/>
-    <w:rsid w:val="306C7EFE"/>
-    <w:rsid w:val="306D1203"/>
-    <w:rsid w:val="308974AE"/>
-    <w:rsid w:val="309A30A0"/>
-    <w:rsid w:val="30B20672"/>
-    <w:rsid w:val="30B43B75"/>
-    <w:rsid w:val="30B57174"/>
-    <w:rsid w:val="30E111C1"/>
-    <w:rsid w:val="30E26C43"/>
-    <w:rsid w:val="30E92D4B"/>
-    <w:rsid w:val="30F77AE2"/>
-    <w:rsid w:val="31066E50"/>
-    <w:rsid w:val="31494069"/>
-    <w:rsid w:val="314B289F"/>
-    <w:rsid w:val="315B5608"/>
-    <w:rsid w:val="3168491E"/>
-    <w:rsid w:val="31696A05"/>
-    <w:rsid w:val="319F2879"/>
-    <w:rsid w:val="31AA2E09"/>
-    <w:rsid w:val="31C97E3A"/>
-    <w:rsid w:val="320C34EA"/>
-    <w:rsid w:val="32167F39"/>
-    <w:rsid w:val="321A6940"/>
-    <w:rsid w:val="322C20DD"/>
-    <w:rsid w:val="328672F4"/>
-    <w:rsid w:val="32A746EB"/>
-    <w:rsid w:val="32AF4C35"/>
-    <w:rsid w:val="32B92FC6"/>
-    <w:rsid w:val="332116F0"/>
-    <w:rsid w:val="333A4819"/>
-    <w:rsid w:val="335330C3"/>
-    <w:rsid w:val="33554F18"/>
-    <w:rsid w:val="3389018D"/>
-    <w:rsid w:val="338E7B26"/>
-    <w:rsid w:val="339077A6"/>
-    <w:rsid w:val="33AB1655"/>
-    <w:rsid w:val="33AC70D6"/>
-    <w:rsid w:val="33B444E3"/>
-    <w:rsid w:val="33BA05EA"/>
-    <w:rsid w:val="34034262"/>
-    <w:rsid w:val="3415172A"/>
-    <w:rsid w:val="349302CD"/>
-    <w:rsid w:val="34A22AE6"/>
-    <w:rsid w:val="352F698B"/>
-    <w:rsid w:val="35353D4F"/>
-    <w:rsid w:val="353E2273"/>
-    <w:rsid w:val="355D101B"/>
-    <w:rsid w:val="359A6901"/>
-    <w:rsid w:val="35A23D0E"/>
-    <w:rsid w:val="35A7514A"/>
-    <w:rsid w:val="35B361A6"/>
-    <w:rsid w:val="35DB18E9"/>
-    <w:rsid w:val="35EF058A"/>
-    <w:rsid w:val="362E0331"/>
-    <w:rsid w:val="365743B8"/>
-    <w:rsid w:val="36851D82"/>
-    <w:rsid w:val="36BF53DF"/>
-    <w:rsid w:val="37356A70"/>
-    <w:rsid w:val="373B27AA"/>
-    <w:rsid w:val="37424475"/>
-    <w:rsid w:val="374852C0"/>
-    <w:rsid w:val="37E00D3A"/>
-    <w:rsid w:val="37EA1649"/>
-    <w:rsid w:val="37F10D19"/>
-    <w:rsid w:val="38196915"/>
-    <w:rsid w:val="382D0E39"/>
-    <w:rsid w:val="3831783F"/>
-    <w:rsid w:val="3861258D"/>
-    <w:rsid w:val="38660DE1"/>
-    <w:rsid w:val="387821B2"/>
-    <w:rsid w:val="388727CC"/>
-    <w:rsid w:val="388F565A"/>
-    <w:rsid w:val="38AF4C9A"/>
-    <w:rsid w:val="38D41C6A"/>
-    <w:rsid w:val="38F00B77"/>
-    <w:rsid w:val="38F31AFC"/>
-    <w:rsid w:val="38F76303"/>
-    <w:rsid w:val="38FA7A5E"/>
-    <w:rsid w:val="395D152B"/>
-    <w:rsid w:val="396D6845"/>
-    <w:rsid w:val="39792E06"/>
-    <w:rsid w:val="39B371DA"/>
-    <w:rsid w:val="39BE02CB"/>
-    <w:rsid w:val="39C51CE1"/>
-    <w:rsid w:val="39EE3018"/>
-    <w:rsid w:val="3A052C3D"/>
-    <w:rsid w:val="3A076141"/>
-    <w:rsid w:val="3A7022ED"/>
-    <w:rsid w:val="3A852292"/>
-    <w:rsid w:val="3A871F12"/>
-    <w:rsid w:val="3A9E1B37"/>
-    <w:rsid w:val="3AB338E7"/>
-    <w:rsid w:val="3AB939E6"/>
-    <w:rsid w:val="3AF55DC9"/>
-    <w:rsid w:val="3AFE2E55"/>
-    <w:rsid w:val="3AFF67B0"/>
-    <w:rsid w:val="3B123CF2"/>
-    <w:rsid w:val="3B4647D0"/>
-    <w:rsid w:val="3B84171F"/>
-    <w:rsid w:val="3B9D52DD"/>
-    <w:rsid w:val="3BC52B58"/>
-    <w:rsid w:val="3BC95DA1"/>
-    <w:rsid w:val="3BDA7340"/>
-    <w:rsid w:val="3BDD02C5"/>
-    <w:rsid w:val="3BF82174"/>
-    <w:rsid w:val="3BF8295E"/>
-    <w:rsid w:val="3C2506B9"/>
-    <w:rsid w:val="3C321F4D"/>
-    <w:rsid w:val="3C4F72FF"/>
-    <w:rsid w:val="3C7B3647"/>
-    <w:rsid w:val="3C8D6DE4"/>
-    <w:rsid w:val="3CE21B3C"/>
-    <w:rsid w:val="3CF2458A"/>
-    <w:rsid w:val="3D176D48"/>
-    <w:rsid w:val="3D3E1186"/>
-    <w:rsid w:val="3D43308F"/>
-    <w:rsid w:val="3D8C2637"/>
-    <w:rsid w:val="3DE450DE"/>
-    <w:rsid w:val="3E006CC6"/>
-    <w:rsid w:val="3E557A55"/>
-    <w:rsid w:val="3E945048"/>
-    <w:rsid w:val="3E9C6B44"/>
-    <w:rsid w:val="3EA54607"/>
-    <w:rsid w:val="3EAC4C1F"/>
-    <w:rsid w:val="3ED734A6"/>
-    <w:rsid w:val="3EDA7CAE"/>
-    <w:rsid w:val="3F28582E"/>
-    <w:rsid w:val="3FA81600"/>
-    <w:rsid w:val="3FBC281F"/>
-    <w:rsid w:val="3FC03951"/>
-    <w:rsid w:val="3FC10EA5"/>
-    <w:rsid w:val="3FC63020"/>
-    <w:rsid w:val="3FC76631"/>
-    <w:rsid w:val="3FDC001C"/>
-    <w:rsid w:val="3FEE42F3"/>
-    <w:rsid w:val="406F6DF9"/>
-    <w:rsid w:val="40C21D4C"/>
-    <w:rsid w:val="40CE5B5F"/>
-    <w:rsid w:val="4109501D"/>
-    <w:rsid w:val="410D0EC7"/>
-    <w:rsid w:val="411A01DD"/>
-    <w:rsid w:val="41485829"/>
-    <w:rsid w:val="41651556"/>
-    <w:rsid w:val="416A59DD"/>
-    <w:rsid w:val="418C7217"/>
-    <w:rsid w:val="41D23361"/>
-    <w:rsid w:val="41E00530"/>
-    <w:rsid w:val="41E6662C"/>
-    <w:rsid w:val="41EB0AE8"/>
-    <w:rsid w:val="422B001A"/>
-    <w:rsid w:val="42780119"/>
-    <w:rsid w:val="428E22BD"/>
-    <w:rsid w:val="42A32262"/>
-    <w:rsid w:val="42B03AEC"/>
-    <w:rsid w:val="42B5064D"/>
-    <w:rsid w:val="42BB2CEF"/>
-    <w:rsid w:val="42C96C1E"/>
-    <w:rsid w:val="42D96EB9"/>
-    <w:rsid w:val="42E22696"/>
-    <w:rsid w:val="42E5074D"/>
-    <w:rsid w:val="430E3885"/>
-    <w:rsid w:val="43353D4F"/>
-    <w:rsid w:val="43454B44"/>
-    <w:rsid w:val="43461A6B"/>
-    <w:rsid w:val="435941E7"/>
-    <w:rsid w:val="436B4229"/>
-    <w:rsid w:val="439E597D"/>
-    <w:rsid w:val="43C1425A"/>
-    <w:rsid w:val="43D019CF"/>
-    <w:rsid w:val="43D17451"/>
-    <w:rsid w:val="43EB387E"/>
-    <w:rsid w:val="44185647"/>
-    <w:rsid w:val="441B2D48"/>
-    <w:rsid w:val="441E7867"/>
-    <w:rsid w:val="443800FA"/>
-    <w:rsid w:val="44464E91"/>
-    <w:rsid w:val="446134BD"/>
-    <w:rsid w:val="44962692"/>
-    <w:rsid w:val="44B40D48"/>
-    <w:rsid w:val="44D202F8"/>
-    <w:rsid w:val="44D84400"/>
-    <w:rsid w:val="44E12B11"/>
-    <w:rsid w:val="44E35F78"/>
-    <w:rsid w:val="44E36014"/>
-    <w:rsid w:val="44F32A2B"/>
-    <w:rsid w:val="450A0452"/>
-    <w:rsid w:val="455079AF"/>
-    <w:rsid w:val="455517CB"/>
-    <w:rsid w:val="45570552"/>
-    <w:rsid w:val="456F5BF8"/>
-    <w:rsid w:val="45773005"/>
-    <w:rsid w:val="4582269B"/>
-    <w:rsid w:val="45950036"/>
-    <w:rsid w:val="459D0CC6"/>
-    <w:rsid w:val="45B71DEB"/>
-    <w:rsid w:val="45D55C13"/>
-    <w:rsid w:val="46325936"/>
-    <w:rsid w:val="46633F07"/>
-    <w:rsid w:val="469965DF"/>
-    <w:rsid w:val="46B226AF"/>
-    <w:rsid w:val="46C42CA7"/>
-    <w:rsid w:val="46DD1652"/>
-    <w:rsid w:val="46FE3D85"/>
-    <w:rsid w:val="47446A78"/>
-    <w:rsid w:val="474D5189"/>
-    <w:rsid w:val="47B303B1"/>
-    <w:rsid w:val="47BE4FB7"/>
-    <w:rsid w:val="47CA7242"/>
-    <w:rsid w:val="47D408E5"/>
-    <w:rsid w:val="47D927EF"/>
-    <w:rsid w:val="47FC1B1A"/>
-    <w:rsid w:val="47FC6227"/>
-    <w:rsid w:val="48026B5B"/>
-    <w:rsid w:val="484311AB"/>
-    <w:rsid w:val="48A12D6B"/>
-    <w:rsid w:val="48B77A98"/>
-    <w:rsid w:val="48BB0BE3"/>
-    <w:rsid w:val="48C61172"/>
-    <w:rsid w:val="49433FBF"/>
-    <w:rsid w:val="497C5C32"/>
-    <w:rsid w:val="49A40B61"/>
-    <w:rsid w:val="49A73542"/>
-    <w:rsid w:val="49DD673C"/>
-    <w:rsid w:val="49ED225A"/>
-    <w:rsid w:val="49FC11EF"/>
-    <w:rsid w:val="4A0671C6"/>
-    <w:rsid w:val="4A236EB1"/>
-    <w:rsid w:val="4A3600D0"/>
-    <w:rsid w:val="4A4000DB"/>
-    <w:rsid w:val="4A633716"/>
-    <w:rsid w:val="4A6A1823"/>
-    <w:rsid w:val="4A7843BC"/>
-    <w:rsid w:val="4A880DD3"/>
-    <w:rsid w:val="4B1E7BC5"/>
-    <w:rsid w:val="4B416003"/>
-    <w:rsid w:val="4B63783D"/>
-    <w:rsid w:val="4B7145D4"/>
-    <w:rsid w:val="4BA447A5"/>
-    <w:rsid w:val="4BAF1EBA"/>
-    <w:rsid w:val="4BD165CA"/>
-    <w:rsid w:val="4BE36E91"/>
-    <w:rsid w:val="4BFB0CB5"/>
-    <w:rsid w:val="4C087FCB"/>
-    <w:rsid w:val="4C226665"/>
-    <w:rsid w:val="4C4B01B5"/>
-    <w:rsid w:val="4C62635C"/>
-    <w:rsid w:val="4C7E5A0B"/>
-    <w:rsid w:val="4D030B15"/>
-    <w:rsid w:val="4D0933F1"/>
-    <w:rsid w:val="4D331B41"/>
-    <w:rsid w:val="4D7F46B4"/>
-    <w:rsid w:val="4D825639"/>
-    <w:rsid w:val="4D861AC1"/>
-    <w:rsid w:val="4D8D144B"/>
-    <w:rsid w:val="4DB14B03"/>
-    <w:rsid w:val="4DCF7936"/>
-    <w:rsid w:val="4DD15F73"/>
-    <w:rsid w:val="4DDF0D3B"/>
-    <w:rsid w:val="4DEE01EB"/>
-    <w:rsid w:val="4E057E10"/>
-    <w:rsid w:val="4E152629"/>
-    <w:rsid w:val="4E1600AB"/>
-    <w:rsid w:val="4E2B0F4A"/>
-    <w:rsid w:val="4E4A5082"/>
-    <w:rsid w:val="4E501189"/>
-    <w:rsid w:val="4E5F470C"/>
-    <w:rsid w:val="4E6301AA"/>
-    <w:rsid w:val="4ECD6554"/>
-    <w:rsid w:val="4F4C0128"/>
-    <w:rsid w:val="4F564B0B"/>
-    <w:rsid w:val="4F7E3DC7"/>
-    <w:rsid w:val="4F8C0F11"/>
-    <w:rsid w:val="4F9E0E2B"/>
-    <w:rsid w:val="4FBE7162"/>
-    <w:rsid w:val="4FCD197A"/>
-    <w:rsid w:val="4FF727BF"/>
-    <w:rsid w:val="50000ED0"/>
-    <w:rsid w:val="50155AC5"/>
-    <w:rsid w:val="50175272"/>
-    <w:rsid w:val="50186577"/>
-    <w:rsid w:val="50242389"/>
-    <w:rsid w:val="50342624"/>
-    <w:rsid w:val="50406436"/>
-    <w:rsid w:val="504273BB"/>
-    <w:rsid w:val="506E1504"/>
-    <w:rsid w:val="508C2CB2"/>
-    <w:rsid w:val="50BC3801"/>
-    <w:rsid w:val="50C777A3"/>
-    <w:rsid w:val="50D21228"/>
-    <w:rsid w:val="50DC4336"/>
-    <w:rsid w:val="50EC654F"/>
-    <w:rsid w:val="510B6E04"/>
-    <w:rsid w:val="510C42D5"/>
-    <w:rsid w:val="512E60BF"/>
-    <w:rsid w:val="514C251F"/>
-    <w:rsid w:val="51933655"/>
-    <w:rsid w:val="51C81DA8"/>
-    <w:rsid w:val="52133DB3"/>
-    <w:rsid w:val="52425C57"/>
-    <w:rsid w:val="52E41F0D"/>
-    <w:rsid w:val="53080E48"/>
-    <w:rsid w:val="531C58EA"/>
-    <w:rsid w:val="533927A1"/>
-    <w:rsid w:val="535D6353"/>
-    <w:rsid w:val="53750CA7"/>
-    <w:rsid w:val="53750D57"/>
-    <w:rsid w:val="53832D10"/>
-    <w:rsid w:val="538D6EA3"/>
-    <w:rsid w:val="53AD0C9B"/>
-    <w:rsid w:val="53BA0C6B"/>
-    <w:rsid w:val="53FA3C53"/>
-    <w:rsid w:val="53FB16D5"/>
-    <w:rsid w:val="54047DE6"/>
-    <w:rsid w:val="54060DFE"/>
-    <w:rsid w:val="54583FED"/>
-    <w:rsid w:val="54660D84"/>
-    <w:rsid w:val="54676806"/>
-    <w:rsid w:val="54BB1B13"/>
-    <w:rsid w:val="54CB652A"/>
-    <w:rsid w:val="54E97288"/>
-    <w:rsid w:val="54ED7D64"/>
-    <w:rsid w:val="55257EBD"/>
-    <w:rsid w:val="55304C19"/>
-    <w:rsid w:val="55403599"/>
-    <w:rsid w:val="555B0397"/>
-    <w:rsid w:val="55630459"/>
-    <w:rsid w:val="557312C2"/>
-    <w:rsid w:val="55846FDD"/>
-    <w:rsid w:val="55DB4169"/>
-    <w:rsid w:val="55E502FC"/>
-    <w:rsid w:val="56096C07"/>
-    <w:rsid w:val="56156651"/>
-    <w:rsid w:val="561E3959"/>
-    <w:rsid w:val="56362D23"/>
-    <w:rsid w:val="564D31A3"/>
-    <w:rsid w:val="566A2753"/>
-    <w:rsid w:val="566F245E"/>
-    <w:rsid w:val="56792D6E"/>
-    <w:rsid w:val="56874282"/>
-    <w:rsid w:val="56956E1A"/>
-    <w:rsid w:val="56A603BA"/>
-    <w:rsid w:val="56AE1F43"/>
-    <w:rsid w:val="56BF5CE5"/>
-    <w:rsid w:val="56D9408C"/>
-    <w:rsid w:val="57096DD9"/>
-    <w:rsid w:val="57171972"/>
-    <w:rsid w:val="571B617B"/>
-    <w:rsid w:val="57343D84"/>
-    <w:rsid w:val="574955B3"/>
-    <w:rsid w:val="57561CC4"/>
-    <w:rsid w:val="57AC65E2"/>
-    <w:rsid w:val="57BB053A"/>
-    <w:rsid w:val="57BE66C6"/>
-    <w:rsid w:val="57C80B09"/>
-    <w:rsid w:val="57E91CCB"/>
-    <w:rsid w:val="57FA6E5A"/>
-    <w:rsid w:val="580F4463"/>
-    <w:rsid w:val="58144D0D"/>
-    <w:rsid w:val="583D2848"/>
-    <w:rsid w:val="58553C2C"/>
-    <w:rsid w:val="587902B5"/>
-    <w:rsid w:val="58B520A6"/>
-    <w:rsid w:val="58C603B4"/>
-    <w:rsid w:val="58F52955"/>
-    <w:rsid w:val="58F55680"/>
-    <w:rsid w:val="593B1D25"/>
-    <w:rsid w:val="59450902"/>
-    <w:rsid w:val="596B01D1"/>
-    <w:rsid w:val="59A6337C"/>
-    <w:rsid w:val="5A126D51"/>
-    <w:rsid w:val="5AAA3A4D"/>
-    <w:rsid w:val="5ABE4081"/>
-    <w:rsid w:val="5AE738B1"/>
-    <w:rsid w:val="5B057B9F"/>
-    <w:rsid w:val="5B195385"/>
-    <w:rsid w:val="5B1E4F6A"/>
-    <w:rsid w:val="5B37393C"/>
-    <w:rsid w:val="5B5F56B4"/>
-    <w:rsid w:val="5B761E9C"/>
-    <w:rsid w:val="5B80602E"/>
-    <w:rsid w:val="5BA57168"/>
-    <w:rsid w:val="5BA913F1"/>
-    <w:rsid w:val="5BC16A98"/>
-    <w:rsid w:val="5C1F35AE"/>
-    <w:rsid w:val="5C2A4CC2"/>
-    <w:rsid w:val="5C4B69FC"/>
-    <w:rsid w:val="5C63081F"/>
-    <w:rsid w:val="5C7F48CC"/>
-    <w:rsid w:val="5C9B41FC"/>
-    <w:rsid w:val="5CAE321D"/>
-    <w:rsid w:val="5CB55DF0"/>
-    <w:rsid w:val="5CB6590F"/>
-    <w:rsid w:val="5CC52E42"/>
-    <w:rsid w:val="5CD22158"/>
-    <w:rsid w:val="5CF32E87"/>
-    <w:rsid w:val="5D0019A2"/>
-    <w:rsid w:val="5D1B7FCE"/>
-    <w:rsid w:val="5D564930"/>
-    <w:rsid w:val="5DB81151"/>
-    <w:rsid w:val="5DC913EB"/>
-    <w:rsid w:val="5DD50A81"/>
-    <w:rsid w:val="5DEB2EFB"/>
-    <w:rsid w:val="5E6B69F6"/>
-    <w:rsid w:val="5E95783A"/>
-    <w:rsid w:val="5EA26B50"/>
-    <w:rsid w:val="5EC9251D"/>
-    <w:rsid w:val="5ED50624"/>
-    <w:rsid w:val="5F7E303B"/>
-    <w:rsid w:val="5F821A41"/>
-    <w:rsid w:val="5FD614CB"/>
-    <w:rsid w:val="5FD96BCD"/>
-    <w:rsid w:val="5FDE0AD6"/>
-    <w:rsid w:val="5FE307E1"/>
-    <w:rsid w:val="60772C01"/>
-    <w:rsid w:val="60D96770"/>
-    <w:rsid w:val="60E2707F"/>
-    <w:rsid w:val="61093233"/>
-    <w:rsid w:val="610D3747"/>
-    <w:rsid w:val="61333986"/>
-    <w:rsid w:val="613E14B5"/>
-    <w:rsid w:val="61433C21"/>
-    <w:rsid w:val="618A23F1"/>
-    <w:rsid w:val="61996BAE"/>
-    <w:rsid w:val="619D44E4"/>
-    <w:rsid w:val="61A161B8"/>
-    <w:rsid w:val="61A429C0"/>
-    <w:rsid w:val="61CA737D"/>
-    <w:rsid w:val="624060C2"/>
-    <w:rsid w:val="62C216A0"/>
-    <w:rsid w:val="62FC09F3"/>
-    <w:rsid w:val="632366B5"/>
-    <w:rsid w:val="632927BC"/>
-    <w:rsid w:val="632C3741"/>
-    <w:rsid w:val="63723EB5"/>
-    <w:rsid w:val="63806A4E"/>
-    <w:rsid w:val="63980872"/>
-    <w:rsid w:val="639F3A80"/>
-    <w:rsid w:val="63C329BB"/>
-    <w:rsid w:val="63E663F3"/>
-    <w:rsid w:val="641F31CC"/>
-    <w:rsid w:val="64204DCB"/>
-    <w:rsid w:val="645A0930"/>
-    <w:rsid w:val="645C18B4"/>
-    <w:rsid w:val="645F063B"/>
-    <w:rsid w:val="64637041"/>
-    <w:rsid w:val="649C5F21"/>
-    <w:rsid w:val="64D07675"/>
-    <w:rsid w:val="64D6157E"/>
-    <w:rsid w:val="64D811FE"/>
-    <w:rsid w:val="64DA1AB0"/>
-    <w:rsid w:val="64DF440C"/>
-    <w:rsid w:val="64F07680"/>
-    <w:rsid w:val="64F71AB3"/>
-    <w:rsid w:val="65123962"/>
-    <w:rsid w:val="6541736E"/>
-    <w:rsid w:val="65644665"/>
-    <w:rsid w:val="656A3FF0"/>
-    <w:rsid w:val="656C74F3"/>
-    <w:rsid w:val="65790D87"/>
-    <w:rsid w:val="65A705D2"/>
-    <w:rsid w:val="65E43CBA"/>
-    <w:rsid w:val="660718F0"/>
-    <w:rsid w:val="662F5033"/>
-    <w:rsid w:val="666B1614"/>
-    <w:rsid w:val="666E039B"/>
-    <w:rsid w:val="667941AD"/>
-    <w:rsid w:val="66CF7DDA"/>
-    <w:rsid w:val="66E32558"/>
-    <w:rsid w:val="66E66D60"/>
-    <w:rsid w:val="66E74BD2"/>
-    <w:rsid w:val="66EC0C69"/>
-    <w:rsid w:val="67022E0D"/>
-    <w:rsid w:val="670954ED"/>
-    <w:rsid w:val="675A6D1E"/>
-    <w:rsid w:val="676550B0"/>
-    <w:rsid w:val="67694780"/>
-    <w:rsid w:val="677B2AD6"/>
-    <w:rsid w:val="67CA2856"/>
-    <w:rsid w:val="67F72420"/>
-    <w:rsid w:val="68112FCA"/>
-    <w:rsid w:val="682124BD"/>
-    <w:rsid w:val="684F6332"/>
-    <w:rsid w:val="68562439"/>
-    <w:rsid w:val="685C4343"/>
-    <w:rsid w:val="6863174F"/>
-    <w:rsid w:val="68696EDC"/>
-    <w:rsid w:val="687377EB"/>
-    <w:rsid w:val="68916D9B"/>
-    <w:rsid w:val="68B711D9"/>
-    <w:rsid w:val="68BF03A3"/>
-    <w:rsid w:val="68C078EA"/>
-    <w:rsid w:val="68C617F4"/>
-    <w:rsid w:val="698F12ED"/>
-    <w:rsid w:val="699D5FD4"/>
-    <w:rsid w:val="699D695F"/>
-    <w:rsid w:val="69AF3970"/>
-    <w:rsid w:val="69B14C74"/>
-    <w:rsid w:val="69DB5AB9"/>
-    <w:rsid w:val="69E80D36"/>
-    <w:rsid w:val="69EF255B"/>
-    <w:rsid w:val="6A0E500E"/>
-    <w:rsid w:val="6A182979"/>
-    <w:rsid w:val="6A2471B2"/>
-    <w:rsid w:val="6A257F5C"/>
-    <w:rsid w:val="6A71070E"/>
-    <w:rsid w:val="6A8310CA"/>
-    <w:rsid w:val="6AC112D0"/>
-    <w:rsid w:val="6AC45A36"/>
-    <w:rsid w:val="6B3E5700"/>
-    <w:rsid w:val="6B7071D4"/>
-    <w:rsid w:val="6B865AF4"/>
-    <w:rsid w:val="6B8D0D02"/>
-    <w:rsid w:val="6B901C87"/>
-    <w:rsid w:val="6B973810"/>
-    <w:rsid w:val="6B9D5719"/>
-    <w:rsid w:val="6B9F5B36"/>
-    <w:rsid w:val="6BA350A4"/>
-    <w:rsid w:val="6BCA0B67"/>
-    <w:rsid w:val="6BD15F74"/>
-    <w:rsid w:val="6C0576C7"/>
-    <w:rsid w:val="6C1351BE"/>
-    <w:rsid w:val="6C236A70"/>
-    <w:rsid w:val="6C9128CB"/>
-    <w:rsid w:val="6C920E9E"/>
-    <w:rsid w:val="6CC27A7A"/>
-    <w:rsid w:val="6D180489"/>
-    <w:rsid w:val="6D1D4911"/>
-    <w:rsid w:val="6D3978A6"/>
-    <w:rsid w:val="6D533436"/>
-    <w:rsid w:val="6D827EB8"/>
-    <w:rsid w:val="6D876D89"/>
-    <w:rsid w:val="6D9510D7"/>
-    <w:rsid w:val="6D997ADE"/>
-    <w:rsid w:val="6D9A555F"/>
-    <w:rsid w:val="6DDD14CC"/>
-    <w:rsid w:val="6DDD4D4F"/>
-    <w:rsid w:val="6DF36CBE"/>
-    <w:rsid w:val="6E010407"/>
-    <w:rsid w:val="6E632A2A"/>
-    <w:rsid w:val="6E866461"/>
-    <w:rsid w:val="6EB92134"/>
-    <w:rsid w:val="6EC5724B"/>
-    <w:rsid w:val="6ED77165"/>
-    <w:rsid w:val="6F166BB9"/>
-    <w:rsid w:val="6F3F170B"/>
-    <w:rsid w:val="6F457799"/>
-    <w:rsid w:val="6F6A5455"/>
-    <w:rsid w:val="6F961B22"/>
-    <w:rsid w:val="6FA37B33"/>
-    <w:rsid w:val="6FC45D03"/>
-    <w:rsid w:val="6FD0517F"/>
-    <w:rsid w:val="6FDF3CE2"/>
-    <w:rsid w:val="6FDF7455"/>
-    <w:rsid w:val="704354BE"/>
-    <w:rsid w:val="70524453"/>
-    <w:rsid w:val="70531ED5"/>
-    <w:rsid w:val="70876EAC"/>
-    <w:rsid w:val="70A371F9"/>
-    <w:rsid w:val="70A63106"/>
-    <w:rsid w:val="70C2380D"/>
-    <w:rsid w:val="70D04D21"/>
-    <w:rsid w:val="710245F7"/>
-    <w:rsid w:val="712170AA"/>
-    <w:rsid w:val="7137124E"/>
-    <w:rsid w:val="716A2D22"/>
-    <w:rsid w:val="716F4C2B"/>
-    <w:rsid w:val="717B0A3E"/>
-    <w:rsid w:val="718844D0"/>
-    <w:rsid w:val="71AB4BC9"/>
-    <w:rsid w:val="72334969"/>
-    <w:rsid w:val="724E6817"/>
-    <w:rsid w:val="725F6B99"/>
-    <w:rsid w:val="727608D5"/>
-    <w:rsid w:val="72866971"/>
-    <w:rsid w:val="72C5775B"/>
-    <w:rsid w:val="72EA047A"/>
-    <w:rsid w:val="72FD3138"/>
-    <w:rsid w:val="731618CD"/>
-    <w:rsid w:val="732E0084"/>
-    <w:rsid w:val="734D0DCF"/>
-    <w:rsid w:val="735F40D6"/>
-    <w:rsid w:val="736C11ED"/>
-    <w:rsid w:val="73730B78"/>
-    <w:rsid w:val="740E632F"/>
-    <w:rsid w:val="74157F65"/>
-    <w:rsid w:val="743069AD"/>
-    <w:rsid w:val="7443595E"/>
-    <w:rsid w:val="7444778E"/>
-    <w:rsid w:val="744978D7"/>
-    <w:rsid w:val="744E5F5D"/>
-    <w:rsid w:val="749F4A62"/>
-    <w:rsid w:val="74A4476D"/>
-    <w:rsid w:val="74B8340E"/>
-    <w:rsid w:val="74B90E8F"/>
-    <w:rsid w:val="74C04F97"/>
-    <w:rsid w:val="74CA60F4"/>
-    <w:rsid w:val="75263A42"/>
-    <w:rsid w:val="75360459"/>
-    <w:rsid w:val="75394C61"/>
-    <w:rsid w:val="75487423"/>
-    <w:rsid w:val="7585185D"/>
-    <w:rsid w:val="759D593D"/>
-    <w:rsid w:val="75A0590A"/>
-    <w:rsid w:val="75BC19B7"/>
-    <w:rsid w:val="75EF5689"/>
-    <w:rsid w:val="760807B1"/>
-    <w:rsid w:val="76172CA8"/>
-    <w:rsid w:val="76316F40"/>
-    <w:rsid w:val="7640780E"/>
-    <w:rsid w:val="765B603D"/>
-    <w:rsid w:val="76DF0815"/>
-    <w:rsid w:val="771C067A"/>
-    <w:rsid w:val="771C37F0"/>
-    <w:rsid w:val="773B19CA"/>
-    <w:rsid w:val="775A26DD"/>
-    <w:rsid w:val="77675276"/>
-    <w:rsid w:val="77780474"/>
-    <w:rsid w:val="779B58FB"/>
-    <w:rsid w:val="77C03B55"/>
-    <w:rsid w:val="77C4430A"/>
-    <w:rsid w:val="77E10E1F"/>
-    <w:rsid w:val="77F73860"/>
-    <w:rsid w:val="78306EBD"/>
-    <w:rsid w:val="784D09EB"/>
-    <w:rsid w:val="787A05B6"/>
-    <w:rsid w:val="78BA6E21"/>
-    <w:rsid w:val="78C43EAD"/>
-    <w:rsid w:val="78CD25BE"/>
-    <w:rsid w:val="78E940ED"/>
-    <w:rsid w:val="794558DB"/>
-    <w:rsid w:val="7955121E"/>
-    <w:rsid w:val="797A0159"/>
-    <w:rsid w:val="798A4872"/>
-    <w:rsid w:val="79A556EE"/>
-    <w:rsid w:val="79A757A5"/>
-    <w:rsid w:val="79D917F7"/>
-    <w:rsid w:val="79DB277C"/>
-    <w:rsid w:val="79DD23FB"/>
-    <w:rsid w:val="79E60B0D"/>
-    <w:rsid w:val="79F223A1"/>
-    <w:rsid w:val="7A2250EE"/>
-    <w:rsid w:val="7A591D89"/>
-    <w:rsid w:val="7A5C3FCF"/>
-    <w:rsid w:val="7A66105B"/>
-    <w:rsid w:val="7A7D55B4"/>
-    <w:rsid w:val="7A851910"/>
-    <w:rsid w:val="7A8B709C"/>
-    <w:rsid w:val="7AC46E76"/>
-    <w:rsid w:val="7AEE2282"/>
-    <w:rsid w:val="7AF52EC8"/>
-    <w:rsid w:val="7B703EF9"/>
-    <w:rsid w:val="7B774608"/>
-    <w:rsid w:val="7B7A0F23"/>
-    <w:rsid w:val="7B8749B6"/>
-    <w:rsid w:val="7B8A593A"/>
-    <w:rsid w:val="7BAB16F2"/>
-    <w:rsid w:val="7BC05EBB"/>
-    <w:rsid w:val="7BC671AB"/>
-    <w:rsid w:val="7BC80CA2"/>
-    <w:rsid w:val="7BCC76A8"/>
-    <w:rsid w:val="7BD86D3E"/>
-    <w:rsid w:val="7BE63AD5"/>
-    <w:rsid w:val="7C106E98"/>
-    <w:rsid w:val="7C1D61AE"/>
-    <w:rsid w:val="7C200E74"/>
-    <w:rsid w:val="7C291FC0"/>
-    <w:rsid w:val="7C2F774D"/>
-    <w:rsid w:val="7C8E431A"/>
-    <w:rsid w:val="7C9B487E"/>
-    <w:rsid w:val="7CA7288F"/>
-    <w:rsid w:val="7CB763AC"/>
-    <w:rsid w:val="7CBB05DE"/>
-    <w:rsid w:val="7CC20EBA"/>
-    <w:rsid w:val="7CC443BD"/>
-    <w:rsid w:val="7CD44657"/>
-    <w:rsid w:val="7CD51E2E"/>
-    <w:rsid w:val="7D051A4A"/>
-    <w:rsid w:val="7D1818C9"/>
-    <w:rsid w:val="7D540AF5"/>
-    <w:rsid w:val="7D64554C"/>
-    <w:rsid w:val="7D74675F"/>
-    <w:rsid w:val="7DB165C4"/>
-    <w:rsid w:val="7DC70768"/>
-    <w:rsid w:val="7DD86484"/>
-    <w:rsid w:val="7DE22616"/>
-    <w:rsid w:val="7DEE0627"/>
-    <w:rsid w:val="7DF11FA8"/>
-    <w:rsid w:val="7E001BC6"/>
-    <w:rsid w:val="7E5512D0"/>
-    <w:rsid w:val="7E595AD8"/>
-    <w:rsid w:val="7EC327D2"/>
-    <w:rsid w:val="7F0B7AFA"/>
-    <w:rsid w:val="7F29292E"/>
-    <w:rsid w:val="7F2F6A35"/>
-    <w:rsid w:val="7F743CA6"/>
-    <w:rsid w:val="7FC93370"/>
-  </w:rsids>
-  <m:mathPr>
-    <m:mathFont m:val="Cambria Math"/>
-    <m:brkBin m:val="before"/>
-    <m:brkBinSub m:val="--"/>
-    <m:smallFrac m:val="0"/>
-    <m:dispDef/>
-    <m:lMargin m:val="0"/>
-    <m:rMargin m:val="0"/>
-    <m:defJc m:val="centerGroup"/>
-    <m:wrapIndent m:val="1440"/>
-    <m:intLim m:val="subSup"/>
-    <m:naryLim m:val="undOvr"/>
-  </m:mathPr>
-  <w:themeFontLang w:val="en-US" w:eastAsia="zh-CN"/>
-  <w:clrSchemeMapping w:bg1="light1" w:t1="dark1" w:bg2="light2" w:t2="dark2" w:accent1="accent1" w:accent2="accent2" w:accent3="accent3" w:accent4="accent4" w:accent5="accent5" w:accent6="accent6" w:hyperlink="hyperlink" w:followedHyperlink="followedHyperlink"/>
-  <w:doNotIncludeSubdocsInStats/>
-  <w:shapeDefaults>
-    <o:shapedefaults fillcolor="#FFFFFF" fill="t" stroke="t">
-      <v:fill on="t" focussize="0,0"/>
-      <v:stroke color="#000000"/>
-    </o:shapedefaults>
-    <o:shapelayout v:ext="edit">
-      <o:idmap v:ext="edit" data="1"/>
-    </o:shapelayout>
-  </w:shapeDefaults>
-  <mc:AlternateContent>
-    <mc:Choice Requires="wpsCustomData">
-      <wpsCustomData:typoFeatureVersion val="1"/>
-    </mc:Choice>
-  </mc:AlternateContent>
-</w:settings>
-</file>
-
-<file path=word\styles.xml><?xml version="1.0" encoding="utf-8"?>
+<file path=word/styles.xml><?xml version="1.0" encoding="utf-8"?>
 <w:styles xmlns:mc="http://schemas.openxmlformats.org/markup-compatibility/2006" xmlns:o="urn:schemas-microsoft-com:office:office" xmlns:r="http://schemas.openxmlformats.org/officeDocument/2006/relationships" xmlns:m="http://schemas.openxmlformats.org/officeDocument/2006/math" xmlns:v="urn:schemas-microsoft-com:vml" xmlns:w="http://schemas.openxmlformats.org/wordprocessingml/2006/main" xmlns:w14="http://schemas.microsoft.com/office/word/2010/wordml" xmlns:w10="urn:schemas-microsoft-com:office:word" xmlns:sl="http://schemas.openxmlformats.org/schemaLibrary/2006/main" xmlns:wpsCustomData="http://www.wps.cn/officeDocument/2013/wpsCustomData" mc:Ignorable="w14">
   <w:docDefaults>
     <w:rPrDefault>
@@ -37503,7 +35748,7 @@
 </w:styles>
 </file>
 
-<file path=word\theme\theme1.xml><?xml version="1.0" encoding="utf-8"?>
+<file path=word/theme/theme1.xml><?xml version="1.0" encoding="utf-8"?>
 <a:theme xmlns:a="http://schemas.openxmlformats.org/drawingml/2006/main" name="Office 主题">
   <a:themeElements>
     <a:clrScheme name="Office">
@@ -37756,4 +36001,21 @@
   </a:themeElements>
   <a:objectDefaults/>
 </a:theme>
+</file>
+
+<file path=customXml/item1.xml><?xml version="1.0" encoding="utf-8"?>
+<s:customData xmlns="http://www.wps.cn/officeDocument/2013/wpsCustomData" xmlns:s="http://www.wps.cn/officeDocument/2013/wpsCustomData">
+  <customSectProps/>
+  <customShpExts>
+    <customShpInfo spid="_x0000_s1026" textRotate="1"/>
+  </customShpExts>
+</s:customData>
+</file>
+
+<file path=customXml/itemProps1.xml><?xml version="1.0" encoding="utf-8"?>
+<ds:datastoreItem xmlns:ds="http://schemas.openxmlformats.org/officeDocument/2006/customXml" ds:itemID="{B1977F7D-205B-4081-913C-38D41E755F92}">
+  <ds:schemaRefs>
+    <ds:schemaRef ds:uri="http://www.wps.cn/officeDocument/2013/wpsCustomData"/>
+  </ds:schemaRefs>
+</ds:datastoreItem>
 </file>
</xml_diff>